<commit_message>
PowerBI Task 4 fully finished
</commit_message>
<xml_diff>
--- a/PowerBI Task 4/PowerBILab4_Tutisani.docx
+++ b/PowerBI Task 4/PowerBILab4_Tutisani.docx
@@ -26,7 +26,10 @@
         <w:jc w:val="center"/>
       </w:pPr>
       <w:r>
-        <w:t>Dax Basics</w:t>
+        <w:t>Advanced Reporting Concepts</w:t>
+      </w:r>
+      <w:r>
+        <w:t xml:space="preserve"> </w:t>
       </w:r>
     </w:p>
     <w:p>
@@ -106,10 +109,7 @@
         <w:keepNext/>
       </w:pPr>
       <w:r>
-        <w:t>Configuration Method</w:t>
-      </w:r>
-      <w:r>
-        <w:t xml:space="preserve"> is shown in Screenshots 1, 2 and 3.</w:t>
+        <w:t>Configuration Method is shown in Screenshots 1, 2 and 3.</w:t>
       </w:r>
     </w:p>
     <w:p>
@@ -158,7 +158,16 @@
       <w:r>
         <w:t>Roles were validated in Power BI Desktop before publishing</w:t>
       </w:r>
-      <w:r>
+    </w:p>
+    <w:p>
+      <w:pPr>
+        <w:keepNext/>
+        <w:ind w:left="360"/>
+      </w:pPr>
+      <w:r>
+        <w:rPr>
+          <w:noProof/>
+        </w:rPr>
         <w:drawing>
           <wp:inline distT="0" distB="0" distL="0" distR="0" wp14:anchorId="39AA3889" wp14:editId="1F7F382C">
             <wp:extent cx="5593904" cy="3481705"/>
@@ -225,6 +234,9 @@
         <w:t>1</w:t>
       </w:r>
       <w:r>
+        <w:rPr>
+          <w:noProof/>
+        </w:rPr>
         <w:fldChar w:fldCharType="end"/>
       </w:r>
       <w:r>
@@ -243,6 +255,9 @@
         <w:keepNext/>
       </w:pPr>
       <w:r>
+        <w:rPr>
+          <w:noProof/>
+        </w:rPr>
         <w:lastRenderedPageBreak/>
         <w:drawing>
           <wp:inline distT="0" distB="0" distL="0" distR="0" wp14:anchorId="522D346C" wp14:editId="313C540E">
@@ -310,6 +325,9 @@
         <w:t>2</w:t>
       </w:r>
       <w:r>
+        <w:rPr>
+          <w:noProof/>
+        </w:rPr>
         <w:fldChar w:fldCharType="end"/>
       </w:r>
       <w:r>
@@ -328,6 +346,9 @@
         <w:keepNext/>
       </w:pPr>
       <w:r>
+        <w:rPr>
+          <w:noProof/>
+        </w:rPr>
         <w:drawing>
           <wp:inline distT="0" distB="0" distL="0" distR="0" wp14:anchorId="6A6A7D62" wp14:editId="0B8778AC">
             <wp:extent cx="5943600" cy="3485515"/>
@@ -388,6 +409,9 @@
         <w:t>3</w:t>
       </w:r>
       <w:r>
+        <w:rPr>
+          <w:noProof/>
+        </w:rPr>
         <w:fldChar w:fldCharType="end"/>
       </w:r>
       <w:r>
@@ -399,6 +423,9 @@
         <w:keepNext/>
       </w:pPr>
       <w:r>
+        <w:rPr>
+          <w:noProof/>
+        </w:rPr>
         <w:lastRenderedPageBreak/>
         <w:drawing>
           <wp:inline distT="0" distB="0" distL="0" distR="0" wp14:anchorId="2D6C9B07" wp14:editId="37BA20EB">
@@ -466,6 +493,9 @@
         <w:t>4</w:t>
       </w:r>
       <w:r>
+        <w:rPr>
+          <w:noProof/>
+        </w:rPr>
         <w:fldChar w:fldCharType="end"/>
       </w:r>
       <w:r>
@@ -478,9 +508,12 @@
         <w:keepNext/>
       </w:pPr>
       <w:r>
+        <w:rPr>
+          <w:noProof/>
+        </w:rPr>
         <w:drawing>
-          <wp:inline distT="0" distB="0" distL="0" distR="0" wp14:anchorId="40082371" wp14:editId="2123D5DF">
-            <wp:extent cx="5638800" cy="3965836"/>
+          <wp:inline distT="0" distB="0" distL="0" distR="0" wp14:anchorId="40082371" wp14:editId="06F639C5">
+            <wp:extent cx="5430769" cy="3819525"/>
             <wp:effectExtent l="0" t="0" r="0" b="0"/>
             <wp:docPr id="629794286" name="Picture 1"/>
             <wp:cNvGraphicFramePr>
@@ -502,7 +535,7 @@
                   <pic:spPr>
                     <a:xfrm>
                       <a:off x="0" y="0"/>
-                      <a:ext cx="5639171" cy="3966097"/>
+                      <a:ext cx="5433096" cy="3821162"/>
                     </a:xfrm>
                     <a:prstGeom prst="rect">
                       <a:avLst/>
@@ -538,6 +571,9 @@
         <w:t>5</w:t>
       </w:r>
       <w:r>
+        <w:rPr>
+          <w:noProof/>
+        </w:rPr>
         <w:fldChar w:fldCharType="end"/>
       </w:r>
       <w:r>
@@ -548,6 +584,9 @@
       <w:pPr>
         <w:pStyle w:val="Heading1"/>
       </w:pPr>
+      <w:r>
+        <w:br w:type="page"/>
+      </w:r>
       <w:r>
         <w:lastRenderedPageBreak/>
         <w:t>BOOKMARKS &amp; BUTTONS</w:t>
@@ -648,13 +687,7 @@
         </w:numPr>
       </w:pPr>
       <w:r>
-        <w:t xml:space="preserve">The Selections pane (View tab </w:t>
-      </w:r>
-      <w:r>
-        <w:t>-&gt;</w:t>
-      </w:r>
-      <w:r>
-        <w:t xml:space="preserve"> Selections) was opened to manage visual visibility</w:t>
+        <w:t>The Selections pane (View tab -&gt; Selections) was opened to manage visual visibility</w:t>
       </w:r>
     </w:p>
     <w:p>
@@ -735,6 +768,9 @@
         <w:keepNext/>
       </w:pPr>
       <w:r>
+        <w:rPr>
+          <w:noProof/>
+        </w:rPr>
         <w:lastRenderedPageBreak/>
         <w:drawing>
           <wp:inline distT="0" distB="0" distL="0" distR="0" wp14:anchorId="585D1089" wp14:editId="4F24D957">
@@ -796,6 +832,9 @@
         <w:t>6</w:t>
       </w:r>
       <w:r>
+        <w:rPr>
+          <w:noProof/>
+        </w:rPr>
         <w:fldChar w:fldCharType="end"/>
       </w:r>
       <w:r>
@@ -810,6 +849,9 @@
         <w:keepNext/>
       </w:pPr>
       <w:r>
+        <w:rPr>
+          <w:noProof/>
+        </w:rPr>
         <w:drawing>
           <wp:inline distT="0" distB="0" distL="0" distR="0" wp14:anchorId="60D8DA89" wp14:editId="5EA092BF">
             <wp:extent cx="5943600" cy="2590800"/>
@@ -870,6 +912,9 @@
         <w:t>7</w:t>
       </w:r>
       <w:r>
+        <w:rPr>
+          <w:noProof/>
+        </w:rPr>
         <w:fldChar w:fldCharType="end"/>
       </w:r>
       <w:r>
@@ -880,12 +925,250 @@
       </w:r>
     </w:p>
     <w:p/>
-    <w:p>
-      <w:r>
+    <w:p/>
+    <w:p>
+      <w:r>
+        <w:br w:type="page"/>
+      </w:r>
+    </w:p>
+    <w:p>
+      <w:pPr>
+        <w:pStyle w:val="Heading1"/>
+      </w:pPr>
+      <w:r>
+        <w:lastRenderedPageBreak/>
+        <w:t>DYNAMIC TIME PERIOD SWITCHING (MTD/QTD/YTD)</w:t>
+      </w:r>
+    </w:p>
+    <w:p>
+      <w:r>
+        <w:t>On the YTD calculation page, I added the ability to switch between Month-To-Date (MTD), Quarter-To-Date (QTD), and Year-To-Date (YTD) views.</w:t>
+      </w:r>
+    </w:p>
+    <w:p>
+      <w:r>
+        <w:t>What I Built:</w:t>
+      </w:r>
+    </w:p>
+    <w:p>
+      <w:pPr>
+        <w:pStyle w:val="ListParagraph"/>
+        <w:numPr>
+          <w:ilvl w:val="0"/>
+          <w:numId w:val="10"/>
+        </w:numPr>
+      </w:pPr>
+      <w:r>
+        <w:t>Created three measures using time intelligence functions:</w:t>
+      </w:r>
+    </w:p>
+    <w:p>
+      <w:pPr>
+        <w:pStyle w:val="ListParagraph"/>
+        <w:numPr>
+          <w:ilvl w:val="1"/>
+          <w:numId w:val="10"/>
+        </w:numPr>
+        <w:rPr>
+          <w:rFonts w:ascii="Consolas" w:hAnsi="Consolas"/>
+        </w:rPr>
+      </w:pPr>
+      <w:r>
+        <w:rPr>
+          <w:rFonts w:ascii="Consolas" w:hAnsi="Consolas"/>
+        </w:rPr>
+        <w:t>MTD Sales = TOTALMTD([Sales Amount], DimDate[FullDateAlternateKey])</w:t>
+      </w:r>
+    </w:p>
+    <w:p>
+      <w:pPr>
+        <w:pStyle w:val="ListParagraph"/>
+        <w:numPr>
+          <w:ilvl w:val="1"/>
+          <w:numId w:val="10"/>
+        </w:numPr>
+        <w:rPr>
+          <w:rFonts w:ascii="Consolas" w:hAnsi="Consolas"/>
+        </w:rPr>
+      </w:pPr>
+      <w:r>
+        <w:rPr>
+          <w:rFonts w:ascii="Consolas" w:hAnsi="Consolas"/>
+        </w:rPr>
+        <w:t>QTD Sales = TOTALQTD([Sales Amount], DimDate[FullDateAlternateKey])</w:t>
+      </w:r>
+    </w:p>
+    <w:p>
+      <w:pPr>
+        <w:pStyle w:val="ListParagraph"/>
+        <w:numPr>
+          <w:ilvl w:val="1"/>
+          <w:numId w:val="10"/>
+        </w:numPr>
+      </w:pPr>
+      <w:r>
+        <w:rPr>
+          <w:rFonts w:ascii="Consolas" w:hAnsi="Consolas"/>
+        </w:rPr>
+        <w:t>YTD Sales = TOTALYTD([Sales Amount], DimDate[FullDateAlternateKey])</w:t>
+      </w:r>
+    </w:p>
+    <w:p>
+      <w:pPr>
+        <w:pStyle w:val="ListParagraph"/>
+        <w:numPr>
+          <w:ilvl w:val="0"/>
+          <w:numId w:val="10"/>
+        </w:numPr>
+      </w:pPr>
+      <w:r>
+        <w:t>Created a "TimePeriod" table with values: MTD, QTD, YTD</w:t>
+      </w:r>
+    </w:p>
+    <w:p>
+      <w:pPr>
+        <w:pStyle w:val="ListParagraph"/>
+        <w:numPr>
+          <w:ilvl w:val="0"/>
+          <w:numId w:val="10"/>
+        </w:numPr>
+      </w:pPr>
+      <w:r>
+        <w:t>Created a dynamic measure using SWITCH logic:</w:t>
+      </w:r>
+    </w:p>
+    <w:p>
+      <w:pPr>
+        <w:ind w:left="1440"/>
+        <w:rPr>
+          <w:rFonts w:ascii="Consolas" w:hAnsi="Consolas"/>
+        </w:rPr>
+      </w:pPr>
+      <w:r>
+        <w:rPr>
+          <w:rFonts w:ascii="Consolas" w:hAnsi="Consolas"/>
+        </w:rPr>
+        <w:t>Selected Time Period = SWITCH(</w:t>
+      </w:r>
+      <w:r>
+        <w:rPr>
+          <w:rFonts w:ascii="Consolas" w:hAnsi="Consolas"/>
+        </w:rPr>
+        <w:br/>
+      </w:r>
+      <w:r>
+        <w:rPr>
+          <w:rFonts w:ascii="Consolas" w:hAnsi="Consolas"/>
+        </w:rPr>
+        <w:t>SELECTEDVALUE(TimePeriod[TimePeriod]),</w:t>
+      </w:r>
+      <w:r>
+        <w:rPr>
+          <w:rFonts w:ascii="Consolas" w:hAnsi="Consolas"/>
+        </w:rPr>
+        <w:br/>
+      </w:r>
+      <w:r>
+        <w:rPr>
+          <w:rFonts w:ascii="Consolas" w:hAnsi="Consolas"/>
+        </w:rPr>
+        <w:t>"MTD", [MTD Sales],</w:t>
+      </w:r>
+      <w:r>
+        <w:rPr>
+          <w:rFonts w:ascii="Consolas" w:hAnsi="Consolas"/>
+        </w:rPr>
+        <w:br/>
+      </w:r>
+      <w:r>
+        <w:rPr>
+          <w:rFonts w:ascii="Consolas" w:hAnsi="Consolas"/>
+        </w:rPr>
+        <w:t>"QTD", [QTD Sales],</w:t>
+      </w:r>
+      <w:r>
+        <w:rPr>
+          <w:rFonts w:ascii="Consolas" w:hAnsi="Consolas"/>
+        </w:rPr>
+        <w:br/>
+      </w:r>
+      <w:r>
+        <w:rPr>
+          <w:rFonts w:ascii="Consolas" w:hAnsi="Consolas"/>
+        </w:rPr>
+        <w:t>"YTD", [YTD Sales],</w:t>
+      </w:r>
+      <w:r>
+        <w:rPr>
+          <w:rFonts w:ascii="Consolas" w:hAnsi="Consolas"/>
+        </w:rPr>
+        <w:br/>
+      </w:r>
+      <w:r>
+        <w:rPr>
+          <w:rFonts w:ascii="Consolas" w:hAnsi="Consolas"/>
+        </w:rPr>
+        <w:t>[YTD Sales]</w:t>
+      </w:r>
+      <w:r>
+        <w:rPr>
+          <w:rFonts w:ascii="Consolas" w:hAnsi="Consolas"/>
+        </w:rPr>
+        <w:br/>
+      </w:r>
+      <w:r>
+        <w:rPr>
+          <w:rFonts w:ascii="Consolas" w:hAnsi="Consolas"/>
+        </w:rPr>
+        <w:t>)</w:t>
+      </w:r>
+    </w:p>
+    <w:p>
+      <w:pPr>
+        <w:pStyle w:val="ListParagraph"/>
+        <w:numPr>
+          <w:ilvl w:val="0"/>
+          <w:numId w:val="10"/>
+        </w:numPr>
+      </w:pPr>
+      <w:r>
+        <w:t>Added a Slicer visual with TimePeriod field for user selection</w:t>
+      </w:r>
+    </w:p>
+    <w:p>
+      <w:pPr>
+        <w:pStyle w:val="ListParagraph"/>
+        <w:numPr>
+          <w:ilvl w:val="0"/>
+          <w:numId w:val="10"/>
+        </w:numPr>
+      </w:pPr>
+      <w:r>
+        <w:t>Updated the chart to use [Selected Time Period]</w:t>
+      </w:r>
+    </w:p>
+    <w:p>
+      <w:r>
+        <w:t>Why This Approach:</w:t>
+      </w:r>
+    </w:p>
+    <w:p>
+      <w:r>
+        <w:t>Using SWITCH with SELECTEDVALUE is flexible and scalable. It allows users to dynamically change the time calculation without modifying the DAX or refreshing the report.</w:t>
+      </w:r>
+    </w:p>
+    <w:p>
+      <w:pPr>
+        <w:keepNext/>
+      </w:pPr>
+      <w:r>
+        <w:rPr>
+          <w:noProof/>
+        </w:rPr>
         <w:lastRenderedPageBreak/>
         <w:drawing>
-          <wp:inline distT="0" distB="0" distL="0" distR="0" wp14:anchorId="7CB05EE7" wp14:editId="00C733E8">
-            <wp:extent cx="5943600" cy="3927475"/>
+          <wp:inline distT="0" distB="0" distL="0" distR="0" wp14:anchorId="7CB05EE7" wp14:editId="2A665442">
+            <wp:extent cx="4676775" cy="3090369"/>
             <wp:effectExtent l="0" t="0" r="0" b="0"/>
             <wp:docPr id="1557068796" name="Picture 1"/>
             <wp:cNvGraphicFramePr>
@@ -907,7 +1190,7 @@
                   <pic:spPr>
                     <a:xfrm>
                       <a:off x="0" y="0"/>
-                      <a:ext cx="5943600" cy="3927475"/>
+                      <a:ext cx="4683500" cy="3094813"/>
                     </a:xfrm>
                     <a:prstGeom prst="rect">
                       <a:avLst/>
@@ -918,6 +1201,1774 @@
             </a:graphic>
           </wp:inline>
         </w:drawing>
+      </w:r>
+    </w:p>
+    <w:p>
+      <w:pPr>
+        <w:pStyle w:val="Caption"/>
+      </w:pPr>
+      <w:r>
+        <w:t xml:space="preserve">Screenshot </w:t>
+      </w:r>
+      <w:r>
+        <w:fldChar w:fldCharType="begin"/>
+      </w:r>
+      <w:r>
+        <w:instrText xml:space="preserve"> SEQ Screenshot \* ARABIC </w:instrText>
+      </w:r>
+      <w:r>
+        <w:fldChar w:fldCharType="separate"/>
+      </w:r>
+      <w:r>
+        <w:rPr>
+          <w:noProof/>
+        </w:rPr>
+        <w:t>8</w:t>
+      </w:r>
+      <w:r>
+        <w:fldChar w:fldCharType="end"/>
+      </w:r>
+      <w:r>
+        <w:t>. TimePeriod Table</w:t>
+      </w:r>
+    </w:p>
+    <w:p>
+      <w:pPr>
+        <w:keepNext/>
+      </w:pPr>
+      <w:r>
+        <w:rPr>
+          <w:noProof/>
+        </w:rPr>
+        <w:drawing>
+          <wp:inline distT="0" distB="0" distL="0" distR="0" wp14:anchorId="5A2EAE77" wp14:editId="1C400DA4">
+            <wp:extent cx="4540444" cy="4000500"/>
+            <wp:effectExtent l="0" t="0" r="0" b="0"/>
+            <wp:docPr id="1385944064" name="Picture 1"/>
+            <wp:cNvGraphicFramePr>
+              <a:graphicFrameLocks xmlns:a="http://schemas.openxmlformats.org/drawingml/2006/main" noChangeAspect="1"/>
+            </wp:cNvGraphicFramePr>
+            <a:graphic xmlns:a="http://schemas.openxmlformats.org/drawingml/2006/main">
+              <a:graphicData uri="http://schemas.openxmlformats.org/drawingml/2006/picture">
+                <pic:pic xmlns:pic="http://schemas.openxmlformats.org/drawingml/2006/picture">
+                  <pic:nvPicPr>
+                    <pic:cNvPr id="1385944064" name="Picture 1"/>
+                    <pic:cNvPicPr/>
+                  </pic:nvPicPr>
+                  <pic:blipFill>
+                    <a:blip r:embed="rId13">
+                      <a:extLst>
+                        <a:ext uri="{28A0092B-C50C-407E-A947-70E740481C1C}">
+                          <a14:useLocalDpi xmlns:a14="http://schemas.microsoft.com/office/drawing/2010/main" val="0"/>
+                        </a:ext>
+                      </a:extLst>
+                    </a:blip>
+                    <a:stretch>
+                      <a:fillRect/>
+                    </a:stretch>
+                  </pic:blipFill>
+                  <pic:spPr>
+                    <a:xfrm>
+                      <a:off x="0" y="0"/>
+                      <a:ext cx="4544290" cy="4003889"/>
+                    </a:xfrm>
+                    <a:prstGeom prst="rect">
+                      <a:avLst/>
+                    </a:prstGeom>
+                  </pic:spPr>
+                </pic:pic>
+              </a:graphicData>
+            </a:graphic>
+          </wp:inline>
+        </w:drawing>
+      </w:r>
+    </w:p>
+    <w:p>
+      <w:pPr>
+        <w:pStyle w:val="Caption"/>
+      </w:pPr>
+      <w:r>
+        <w:t xml:space="preserve">Screenshot </w:t>
+      </w:r>
+      <w:r>
+        <w:fldChar w:fldCharType="begin"/>
+      </w:r>
+      <w:r>
+        <w:instrText xml:space="preserve"> SEQ Screenshot \* ARABIC </w:instrText>
+      </w:r>
+      <w:r>
+        <w:fldChar w:fldCharType="separate"/>
+      </w:r>
+      <w:r>
+        <w:rPr>
+          <w:noProof/>
+        </w:rPr>
+        <w:t>9</w:t>
+      </w:r>
+      <w:r>
+        <w:rPr>
+          <w:noProof/>
+        </w:rPr>
+        <w:fldChar w:fldCharType="end"/>
+      </w:r>
+      <w:r>
+        <w:t xml:space="preserve">. </w:t>
+      </w:r>
+      <w:r>
+        <w:t>Chart with slicer showing YTD view</w:t>
+      </w:r>
+    </w:p>
+    <w:p/>
+    <w:p>
+      <w:pPr>
+        <w:keepNext/>
+      </w:pPr>
+      <w:r>
+        <w:lastRenderedPageBreak/>
+        <w:drawing>
+          <wp:inline distT="0" distB="0" distL="0" distR="0" wp14:anchorId="68FB6909" wp14:editId="58CFBCA0">
+            <wp:extent cx="4038600" cy="3623676"/>
+            <wp:effectExtent l="0" t="0" r="0" b="0"/>
+            <wp:docPr id="1558085728" name="Picture 1"/>
+            <wp:cNvGraphicFramePr>
+              <a:graphicFrameLocks xmlns:a="http://schemas.openxmlformats.org/drawingml/2006/main" noChangeAspect="1"/>
+            </wp:cNvGraphicFramePr>
+            <a:graphic xmlns:a="http://schemas.openxmlformats.org/drawingml/2006/main">
+              <a:graphicData uri="http://schemas.openxmlformats.org/drawingml/2006/picture">
+                <pic:pic xmlns:pic="http://schemas.openxmlformats.org/drawingml/2006/picture">
+                  <pic:nvPicPr>
+                    <pic:cNvPr id="1558085728" name=""/>
+                    <pic:cNvPicPr/>
+                  </pic:nvPicPr>
+                  <pic:blipFill>
+                    <a:blip r:embed="rId14"/>
+                    <a:stretch>
+                      <a:fillRect/>
+                    </a:stretch>
+                  </pic:blipFill>
+                  <pic:spPr>
+                    <a:xfrm>
+                      <a:off x="0" y="0"/>
+                      <a:ext cx="4050503" cy="3634356"/>
+                    </a:xfrm>
+                    <a:prstGeom prst="rect">
+                      <a:avLst/>
+                    </a:prstGeom>
+                  </pic:spPr>
+                </pic:pic>
+              </a:graphicData>
+            </a:graphic>
+          </wp:inline>
+        </w:drawing>
+      </w:r>
+    </w:p>
+    <w:p>
+      <w:pPr>
+        <w:pStyle w:val="Caption"/>
+      </w:pPr>
+      <w:r>
+        <w:t xml:space="preserve">Screenshot </w:t>
+      </w:r>
+      <w:r>
+        <w:fldChar w:fldCharType="begin"/>
+      </w:r>
+      <w:r>
+        <w:instrText xml:space="preserve"> SEQ Screenshot \* ARABIC </w:instrText>
+      </w:r>
+      <w:r>
+        <w:fldChar w:fldCharType="separate"/>
+      </w:r>
+      <w:r>
+        <w:rPr>
+          <w:noProof/>
+        </w:rPr>
+        <w:t>10</w:t>
+      </w:r>
+      <w:r>
+        <w:fldChar w:fldCharType="end"/>
+      </w:r>
+      <w:r>
+        <w:t xml:space="preserve">. </w:t>
+      </w:r>
+      <w:r>
+        <w:t xml:space="preserve">Chart with slicer showing </w:t>
+      </w:r>
+      <w:r>
+        <w:t xml:space="preserve">MTD </w:t>
+      </w:r>
+      <w:r>
+        <w:t>view</w:t>
+      </w:r>
+    </w:p>
+    <w:p>
+      <w:pPr>
+        <w:keepNext/>
+      </w:pPr>
+      <w:r>
+        <w:drawing>
+          <wp:inline distT="0" distB="0" distL="0" distR="0" wp14:anchorId="002B4B1B" wp14:editId="586A9667">
+            <wp:extent cx="3935822" cy="3657600"/>
+            <wp:effectExtent l="0" t="0" r="7620" b="0"/>
+            <wp:docPr id="43663504" name="Picture 1"/>
+            <wp:cNvGraphicFramePr>
+              <a:graphicFrameLocks xmlns:a="http://schemas.openxmlformats.org/drawingml/2006/main" noChangeAspect="1"/>
+            </wp:cNvGraphicFramePr>
+            <a:graphic xmlns:a="http://schemas.openxmlformats.org/drawingml/2006/main">
+              <a:graphicData uri="http://schemas.openxmlformats.org/drawingml/2006/picture">
+                <pic:pic xmlns:pic="http://schemas.openxmlformats.org/drawingml/2006/picture">
+                  <pic:nvPicPr>
+                    <pic:cNvPr id="43663504" name=""/>
+                    <pic:cNvPicPr/>
+                  </pic:nvPicPr>
+                  <pic:blipFill>
+                    <a:blip r:embed="rId15"/>
+                    <a:stretch>
+                      <a:fillRect/>
+                    </a:stretch>
+                  </pic:blipFill>
+                  <pic:spPr>
+                    <a:xfrm>
+                      <a:off x="0" y="0"/>
+                      <a:ext cx="3956820" cy="3677114"/>
+                    </a:xfrm>
+                    <a:prstGeom prst="rect">
+                      <a:avLst/>
+                    </a:prstGeom>
+                  </pic:spPr>
+                </pic:pic>
+              </a:graphicData>
+            </a:graphic>
+          </wp:inline>
+        </w:drawing>
+      </w:r>
+    </w:p>
+    <w:p>
+      <w:pPr>
+        <w:pStyle w:val="Caption"/>
+      </w:pPr>
+      <w:r>
+        <w:t xml:space="preserve">Screenshot </w:t>
+      </w:r>
+      <w:r>
+        <w:fldChar w:fldCharType="begin"/>
+      </w:r>
+      <w:r>
+        <w:instrText xml:space="preserve"> SEQ Screenshot \* ARABIC </w:instrText>
+      </w:r>
+      <w:r>
+        <w:fldChar w:fldCharType="separate"/>
+      </w:r>
+      <w:r>
+        <w:rPr>
+          <w:noProof/>
+        </w:rPr>
+        <w:t>11</w:t>
+      </w:r>
+      <w:r>
+        <w:fldChar w:fldCharType="end"/>
+      </w:r>
+      <w:r>
+        <w:t xml:space="preserve">. </w:t>
+      </w:r>
+      <w:r>
+        <w:t xml:space="preserve">Chart with slicer showing </w:t>
+      </w:r>
+      <w:r>
+        <w:t>QTD</w:t>
+      </w:r>
+      <w:r>
+        <w:t xml:space="preserve"> view</w:t>
+      </w:r>
+    </w:p>
+    <w:p>
+      <w:pPr>
+        <w:rPr>
+          <w:i/>
+          <w:iCs/>
+          <w:color w:val="0E2841" w:themeColor="text2"/>
+          <w:sz w:val="18"/>
+          <w:szCs w:val="18"/>
+        </w:rPr>
+      </w:pPr>
+      <w:r>
+        <w:br w:type="page"/>
+      </w:r>
+    </w:p>
+    <w:p>
+      <w:pPr>
+        <w:pStyle w:val="Heading1"/>
+      </w:pPr>
+      <w:r>
+        <w:lastRenderedPageBreak/>
+        <w:t>DECOMPOSITION</w:t>
+      </w:r>
+      <w:r>
+        <w:t xml:space="preserve"> TREE</w:t>
+      </w:r>
+    </w:p>
+    <w:p>
+      <w:r>
+        <w:t>The Decomposition Tree is a visual that lets users drill down through multiple dimensions to explore data and find patterns.</w:t>
+      </w:r>
+    </w:p>
+    <w:p>
+      <w:r>
+        <w:t>Configuration:</w:t>
+      </w:r>
+    </w:p>
+    <w:p>
+      <w:pPr>
+        <w:pStyle w:val="ListParagraph"/>
+        <w:numPr>
+          <w:ilvl w:val="0"/>
+          <w:numId w:val="11"/>
+        </w:numPr>
+      </w:pPr>
+      <w:r>
+        <w:t>Analyze: Sales Amount (the metric to understand)</w:t>
+      </w:r>
+    </w:p>
+    <w:p>
+      <w:pPr>
+        <w:pStyle w:val="ListParagraph"/>
+        <w:numPr>
+          <w:ilvl w:val="0"/>
+          <w:numId w:val="11"/>
+        </w:numPr>
+      </w:pPr>
+      <w:r>
+        <w:t>Explain By (3 independent variables):</w:t>
+      </w:r>
+    </w:p>
+    <w:p>
+      <w:pPr>
+        <w:pStyle w:val="ListParagraph"/>
+        <w:numPr>
+          <w:ilvl w:val="0"/>
+          <w:numId w:val="21"/>
+        </w:numPr>
+      </w:pPr>
+      <w:r>
+        <w:t>EnglishProductCategoryName (Product Category)</w:t>
+      </w:r>
+    </w:p>
+    <w:p>
+      <w:pPr>
+        <w:pStyle w:val="ListParagraph"/>
+        <w:numPr>
+          <w:ilvl w:val="0"/>
+          <w:numId w:val="21"/>
+        </w:numPr>
+      </w:pPr>
+      <w:r>
+        <w:t>SalesTerritoryRegion (Region)</w:t>
+      </w:r>
+    </w:p>
+    <w:p>
+      <w:pPr>
+        <w:pStyle w:val="ListParagraph"/>
+        <w:numPr>
+          <w:ilvl w:val="0"/>
+          <w:numId w:val="21"/>
+        </w:numPr>
+      </w:pPr>
+      <w:r>
+        <w:t>CalendarYear (Year)</w:t>
+      </w:r>
+    </w:p>
+    <w:p>
+      <w:r>
+        <w:t>How It Works:</w:t>
+      </w:r>
+    </w:p>
+    <w:p>
+      <w:pPr>
+        <w:pStyle w:val="ListParagraph"/>
+        <w:numPr>
+          <w:ilvl w:val="0"/>
+          <w:numId w:val="15"/>
+        </w:numPr>
+      </w:pPr>
+      <w:r>
+        <w:t>Root node shows total sales across the entire dataset</w:t>
+      </w:r>
+    </w:p>
+    <w:p>
+      <w:pPr>
+        <w:pStyle w:val="ListParagraph"/>
+        <w:numPr>
+          <w:ilvl w:val="0"/>
+          <w:numId w:val="15"/>
+        </w:numPr>
+      </w:pPr>
+      <w:r>
+        <w:t>User clicks the + button to see data split by Category</w:t>
+      </w:r>
+    </w:p>
+    <w:p>
+      <w:pPr>
+        <w:pStyle w:val="ListParagraph"/>
+        <w:numPr>
+          <w:ilvl w:val="0"/>
+          <w:numId w:val="15"/>
+        </w:numPr>
+      </w:pPr>
+      <w:r>
+        <w:t>Drilling further splits by Region to show regional sales within each category</w:t>
+      </w:r>
+    </w:p>
+    <w:p>
+      <w:pPr>
+        <w:pStyle w:val="ListParagraph"/>
+        <w:numPr>
+          <w:ilvl w:val="0"/>
+          <w:numId w:val="15"/>
+        </w:numPr>
+      </w:pPr>
+      <w:r>
+        <w:t>Drilling again splits by Year to show year-over-year trends</w:t>
+      </w:r>
+    </w:p>
+    <w:p>
+      <w:pPr>
+        <w:pStyle w:val="ListParagraph"/>
+        <w:numPr>
+          <w:ilvl w:val="0"/>
+          <w:numId w:val="15"/>
+        </w:numPr>
+      </w:pPr>
+      <w:r>
+        <w:t>Each path tells a story about what drives sales</w:t>
+      </w:r>
+    </w:p>
+    <w:p>
+      <w:r>
+        <w:t>User Value:</w:t>
+      </w:r>
+      <w:r>
+        <w:br/>
+      </w:r>
+      <w:r>
+        <w:t>This visual is ideal for ad-hoc exploration and answering questions like "Why are sales high/low?" Users can navigate dimensions in any order without pre-planned drill-down paths.</w:t>
+      </w:r>
+    </w:p>
+    <w:p>
+      <w:pPr>
+        <w:keepNext/>
+      </w:pPr>
+      <w:r>
+        <w:drawing>
+          <wp:inline distT="0" distB="0" distL="0" distR="0" wp14:anchorId="11A96282" wp14:editId="3B4C8274">
+            <wp:extent cx="5553850" cy="2202684"/>
+            <wp:effectExtent l="0" t="0" r="0" b="7620"/>
+            <wp:docPr id="1491336732" name="Picture 1"/>
+            <wp:cNvGraphicFramePr>
+              <a:graphicFrameLocks xmlns:a="http://schemas.openxmlformats.org/drawingml/2006/main" noChangeAspect="1"/>
+            </wp:cNvGraphicFramePr>
+            <a:graphic xmlns:a="http://schemas.openxmlformats.org/drawingml/2006/main">
+              <a:graphicData uri="http://schemas.openxmlformats.org/drawingml/2006/picture">
+                <pic:pic xmlns:pic="http://schemas.openxmlformats.org/drawingml/2006/picture">
+                  <pic:nvPicPr>
+                    <pic:cNvPr id="1491336732" name="Picture 1"/>
+                    <pic:cNvPicPr/>
+                  </pic:nvPicPr>
+                  <pic:blipFill>
+                    <a:blip r:embed="rId16">
+                      <a:extLst>
+                        <a:ext uri="{28A0092B-C50C-407E-A947-70E740481C1C}">
+                          <a14:useLocalDpi xmlns:a14="http://schemas.microsoft.com/office/drawing/2010/main" val="0"/>
+                        </a:ext>
+                      </a:extLst>
+                    </a:blip>
+                    <a:stretch>
+                      <a:fillRect/>
+                    </a:stretch>
+                  </pic:blipFill>
+                  <pic:spPr>
+                    <a:xfrm>
+                      <a:off x="0" y="0"/>
+                      <a:ext cx="5553850" cy="2202684"/>
+                    </a:xfrm>
+                    <a:prstGeom prst="rect">
+                      <a:avLst/>
+                    </a:prstGeom>
+                  </pic:spPr>
+                </pic:pic>
+              </a:graphicData>
+            </a:graphic>
+          </wp:inline>
+        </w:drawing>
+      </w:r>
+    </w:p>
+    <w:p>
+      <w:pPr>
+        <w:pStyle w:val="Caption"/>
+      </w:pPr>
+      <w:r>
+        <w:t xml:space="preserve">Screenshot </w:t>
+      </w:r>
+      <w:r>
+        <w:fldChar w:fldCharType="begin"/>
+      </w:r>
+      <w:r>
+        <w:instrText xml:space="preserve"> SEQ Screenshot \* ARABIC </w:instrText>
+      </w:r>
+      <w:r>
+        <w:fldChar w:fldCharType="separate"/>
+      </w:r>
+      <w:r>
+        <w:rPr>
+          <w:noProof/>
+        </w:rPr>
+        <w:t>12</w:t>
+      </w:r>
+      <w:r>
+        <w:fldChar w:fldCharType="end"/>
+      </w:r>
+      <w:r>
+        <w:t>. Added visual and its variables</w:t>
+      </w:r>
+    </w:p>
+    <w:p/>
+    <w:p>
+      <w:pPr>
+        <w:keepNext/>
+      </w:pPr>
+      <w:r>
+        <w:lastRenderedPageBreak/>
+        <w:drawing>
+          <wp:inline distT="0" distB="0" distL="0" distR="0" wp14:anchorId="3E292B64" wp14:editId="0A402B61">
+            <wp:extent cx="5943600" cy="4719320"/>
+            <wp:effectExtent l="0" t="0" r="0" b="5080"/>
+            <wp:docPr id="1050264109" name="Picture 1"/>
+            <wp:cNvGraphicFramePr>
+              <a:graphicFrameLocks xmlns:a="http://schemas.openxmlformats.org/drawingml/2006/main" noChangeAspect="1"/>
+            </wp:cNvGraphicFramePr>
+            <a:graphic xmlns:a="http://schemas.openxmlformats.org/drawingml/2006/main">
+              <a:graphicData uri="http://schemas.openxmlformats.org/drawingml/2006/picture">
+                <pic:pic xmlns:pic="http://schemas.openxmlformats.org/drawingml/2006/picture">
+                  <pic:nvPicPr>
+                    <pic:cNvPr id="1050264109" name=""/>
+                    <pic:cNvPicPr/>
+                  </pic:nvPicPr>
+                  <pic:blipFill>
+                    <a:blip r:embed="rId17"/>
+                    <a:stretch>
+                      <a:fillRect/>
+                    </a:stretch>
+                  </pic:blipFill>
+                  <pic:spPr>
+                    <a:xfrm>
+                      <a:off x="0" y="0"/>
+                      <a:ext cx="5943600" cy="4719320"/>
+                    </a:xfrm>
+                    <a:prstGeom prst="rect">
+                      <a:avLst/>
+                    </a:prstGeom>
+                  </pic:spPr>
+                </pic:pic>
+              </a:graphicData>
+            </a:graphic>
+          </wp:inline>
+        </w:drawing>
+      </w:r>
+    </w:p>
+    <w:p>
+      <w:pPr>
+        <w:pStyle w:val="Caption"/>
+      </w:pPr>
+      <w:r>
+        <w:t xml:space="preserve">Screenshot </w:t>
+      </w:r>
+      <w:r>
+        <w:fldChar w:fldCharType="begin"/>
+      </w:r>
+      <w:r>
+        <w:instrText xml:space="preserve"> SEQ Screenshot \* ARABIC </w:instrText>
+      </w:r>
+      <w:r>
+        <w:fldChar w:fldCharType="separate"/>
+      </w:r>
+      <w:r>
+        <w:rPr>
+          <w:noProof/>
+        </w:rPr>
+        <w:t>13</w:t>
+      </w:r>
+      <w:r>
+        <w:fldChar w:fldCharType="end"/>
+      </w:r>
+      <w:r>
+        <w:t xml:space="preserve">. </w:t>
+      </w:r>
+      <w:r>
+        <w:t>Decomposition Tree</w:t>
+      </w:r>
+    </w:p>
+    <w:p/>
+    <w:p>
+      <w:pPr>
+        <w:rPr>
+          <w:rFonts w:eastAsia="Times New Roman" w:cs="Calibri"/>
+          <w:b/>
+          <w:snapToGrid w:val="0"/>
+          <w:kern w:val="28"/>
+          <w:sz w:val="28"/>
+        </w:rPr>
+      </w:pPr>
+      <w:r>
+        <w:br w:type="page"/>
+      </w:r>
+    </w:p>
+    <w:p>
+      <w:pPr>
+        <w:pStyle w:val="Heading1"/>
+      </w:pPr>
+      <w:r>
+        <w:lastRenderedPageBreak/>
+        <w:t>CUSTOM TOOLTIP</w:t>
+      </w:r>
+    </w:p>
+    <w:p>
+      <w:r>
+        <w:t>Custom tooltips provide rich, contextual information when users hover over visuals without cluttering the main report.</w:t>
+      </w:r>
+    </w:p>
+    <w:p>
+      <w:pPr>
+        <w:rPr>
+          <w:b/>
+          <w:bCs/>
+        </w:rPr>
+      </w:pPr>
+      <w:r>
+        <w:rPr>
+          <w:b/>
+          <w:bCs/>
+        </w:rPr>
+        <w:t>What Was Built</w:t>
+      </w:r>
+    </w:p>
+    <w:p>
+      <w:r>
+        <w:t>The tooltip page contains three visuals designed to give deeper insights into each data point:</w:t>
+      </w:r>
+    </w:p>
+    <w:p>
+      <w:pPr>
+        <w:pStyle w:val="ListParagraph"/>
+        <w:numPr>
+          <w:ilvl w:val="0"/>
+          <w:numId w:val="16"/>
+        </w:numPr>
+      </w:pPr>
+      <w:r>
+        <w:t>A card showing Order Quantity (total units ordered)</w:t>
+      </w:r>
+    </w:p>
+    <w:p>
+      <w:pPr>
+        <w:pStyle w:val="ListParagraph"/>
+        <w:numPr>
+          <w:ilvl w:val="0"/>
+          <w:numId w:val="16"/>
+        </w:numPr>
+      </w:pPr>
+      <w:r>
+        <w:t>A card showing Average Order Value (Sales Amount divided by Order Quantity)</w:t>
+      </w:r>
+    </w:p>
+    <w:p>
+      <w:pPr>
+        <w:pStyle w:val="ListParagraph"/>
+        <w:numPr>
+          <w:ilvl w:val="0"/>
+          <w:numId w:val="16"/>
+        </w:numPr>
+      </w:pPr>
+      <w:r>
+        <w:t>A bar chart displaying sales breakdown by product subcategory</w:t>
+      </w:r>
+    </w:p>
+    <w:p>
+      <w:pPr>
+        <w:keepNext/>
+      </w:pPr>
+      <w:r>
+        <w:drawing>
+          <wp:inline distT="0" distB="0" distL="0" distR="0" wp14:anchorId="7169DD03" wp14:editId="319DD864">
+            <wp:extent cx="3324689" cy="2410399"/>
+            <wp:effectExtent l="0" t="0" r="0" b="9525"/>
+            <wp:docPr id="447853235" name="Picture 1"/>
+            <wp:cNvGraphicFramePr>
+              <a:graphicFrameLocks xmlns:a="http://schemas.openxmlformats.org/drawingml/2006/main" noChangeAspect="1"/>
+            </wp:cNvGraphicFramePr>
+            <a:graphic xmlns:a="http://schemas.openxmlformats.org/drawingml/2006/main">
+              <a:graphicData uri="http://schemas.openxmlformats.org/drawingml/2006/picture">
+                <pic:pic xmlns:pic="http://schemas.openxmlformats.org/drawingml/2006/picture">
+                  <pic:nvPicPr>
+                    <pic:cNvPr id="447853235" name="Picture 1"/>
+                    <pic:cNvPicPr/>
+                  </pic:nvPicPr>
+                  <pic:blipFill>
+                    <a:blip r:embed="rId18">
+                      <a:extLst>
+                        <a:ext uri="{28A0092B-C50C-407E-A947-70E740481C1C}">
+                          <a14:useLocalDpi xmlns:a14="http://schemas.microsoft.com/office/drawing/2010/main" val="0"/>
+                        </a:ext>
+                      </a:extLst>
+                    </a:blip>
+                    <a:stretch>
+                      <a:fillRect/>
+                    </a:stretch>
+                  </pic:blipFill>
+                  <pic:spPr>
+                    <a:xfrm>
+                      <a:off x="0" y="0"/>
+                      <a:ext cx="3324689" cy="2410399"/>
+                    </a:xfrm>
+                    <a:prstGeom prst="rect">
+                      <a:avLst/>
+                    </a:prstGeom>
+                  </pic:spPr>
+                </pic:pic>
+              </a:graphicData>
+            </a:graphic>
+          </wp:inline>
+        </w:drawing>
+      </w:r>
+    </w:p>
+    <w:p>
+      <w:pPr>
+        <w:pStyle w:val="Caption"/>
+      </w:pPr>
+      <w:r>
+        <w:t xml:space="preserve">Screenshot </w:t>
+      </w:r>
+      <w:r>
+        <w:fldChar w:fldCharType="begin"/>
+      </w:r>
+      <w:r>
+        <w:instrText xml:space="preserve"> SEQ Screenshot \* ARABIC </w:instrText>
+      </w:r>
+      <w:r>
+        <w:fldChar w:fldCharType="separate"/>
+      </w:r>
+      <w:r>
+        <w:rPr>
+          <w:noProof/>
+        </w:rPr>
+        <w:t>14</w:t>
+      </w:r>
+      <w:r>
+        <w:fldChar w:fldCharType="end"/>
+      </w:r>
+      <w:r>
+        <w:t>. Tooltip</w:t>
+      </w:r>
+    </w:p>
+    <w:p>
+      <w:r>
+        <w:t>These metrics complement the decomposition tree's primary analysis without duplication.</w:t>
+      </w:r>
+    </w:p>
+    <w:p/>
+    <w:p>
+      <w:r>
+        <w:t>Configuration Method</w:t>
+      </w:r>
+    </w:p>
+    <w:p>
+      <w:pPr>
+        <w:pStyle w:val="ListParagraph"/>
+        <w:numPr>
+          <w:ilvl w:val="0"/>
+          <w:numId w:val="17"/>
+        </w:numPr>
+      </w:pPr>
+      <w:r>
+        <w:t>Created a new report page with tooltip canvas size (320px × 240px)</w:t>
+      </w:r>
+    </w:p>
+    <w:p>
+      <w:pPr>
+        <w:pStyle w:val="ListParagraph"/>
+        <w:numPr>
+          <w:ilvl w:val="0"/>
+          <w:numId w:val="17"/>
+        </w:numPr>
+      </w:pPr>
+      <w:r>
+        <w:t>Added three visuals to the tooltip page:</w:t>
+      </w:r>
+    </w:p>
+    <w:p>
+      <w:pPr>
+        <w:pStyle w:val="ListParagraph"/>
+        <w:numPr>
+          <w:ilvl w:val="0"/>
+          <w:numId w:val="19"/>
+        </w:numPr>
+      </w:pPr>
+      <w:r>
+        <w:t>Order Quantity card</w:t>
+      </w:r>
+    </w:p>
+    <w:p>
+      <w:pPr>
+        <w:pStyle w:val="ListParagraph"/>
+        <w:numPr>
+          <w:ilvl w:val="0"/>
+          <w:numId w:val="19"/>
+        </w:numPr>
+      </w:pPr>
+      <w:r>
+        <w:t>Average Order Value card (calculated as Sales Amount / Order Quantity)</w:t>
+      </w:r>
+    </w:p>
+    <w:p>
+      <w:pPr>
+        <w:pStyle w:val="ListParagraph"/>
+        <w:numPr>
+          <w:ilvl w:val="0"/>
+          <w:numId w:val="19"/>
+        </w:numPr>
+      </w:pPr>
+      <w:r>
+        <w:t>Horizontal bar chart showing sales by product subcategory</w:t>
+      </w:r>
+    </w:p>
+    <w:p>
+      <w:pPr>
+        <w:pStyle w:val="ListParagraph"/>
+        <w:numPr>
+          <w:ilvl w:val="0"/>
+          <w:numId w:val="17"/>
+        </w:numPr>
+      </w:pPr>
+      <w:r>
+        <w:t>Enabled the page as a tooltip via Page Information settings</w:t>
+      </w:r>
+    </w:p>
+    <w:p>
+      <w:pPr>
+        <w:pStyle w:val="ListParagraph"/>
+        <w:numPr>
+          <w:ilvl w:val="0"/>
+          <w:numId w:val="17"/>
+        </w:numPr>
+      </w:pPr>
+      <w:r>
+        <w:t>Applied the tooltip to main visuals by setting Tooltips Type to "Report page" and selecting the Tooltip Page</w:t>
+      </w:r>
+    </w:p>
+    <w:p>
+      <w:r>
+        <w:rPr>
+          <w:b/>
+          <w:bCs/>
+        </w:rPr>
+        <w:lastRenderedPageBreak/>
+        <w:t>Why This Approach</w:t>
+      </w:r>
+      <w:r>
+        <w:rPr>
+          <w:b/>
+          <w:bCs/>
+        </w:rPr>
+        <w:br/>
+      </w:r>
+      <w:r>
+        <w:t>Order Quantity and Average Order Value provide actionable insights that sales amount alone cannot convey. For example, high sales could result from high volume or high prices—these metrics clarify which. The subcategory breakdown reveals which product types drive sales within a selected category, adding another layer of analytical depth.</w:t>
+      </w:r>
+    </w:p>
+    <w:p>
+      <w:r>
+        <w:rPr>
+          <w:b/>
+          <w:bCs/>
+        </w:rPr>
+        <w:t>User Experience</w:t>
+      </w:r>
+      <w:r>
+        <w:br/>
+      </w:r>
+      <w:r>
+        <w:t>When users hover over any data point in the decomposition tree, the tooltip appears showing order volume, price per unit, and product mix. This allows users to understand not just how much was sold, but how many units at what average price and which product types contributed to that performance.</w:t>
+      </w:r>
+    </w:p>
+    <w:p>
+      <w:pPr>
+        <w:keepNext/>
+      </w:pPr>
+      <w:r>
+        <w:drawing>
+          <wp:inline distT="0" distB="0" distL="0" distR="0" wp14:anchorId="447795DD" wp14:editId="2EFF073A">
+            <wp:extent cx="5686425" cy="4682586"/>
+            <wp:effectExtent l="0" t="0" r="0" b="3810"/>
+            <wp:docPr id="1812417062" name="Picture 1"/>
+            <wp:cNvGraphicFramePr>
+              <a:graphicFrameLocks xmlns:a="http://schemas.openxmlformats.org/drawingml/2006/main" noChangeAspect="1"/>
+            </wp:cNvGraphicFramePr>
+            <a:graphic xmlns:a="http://schemas.openxmlformats.org/drawingml/2006/main">
+              <a:graphicData uri="http://schemas.openxmlformats.org/drawingml/2006/picture">
+                <pic:pic xmlns:pic="http://schemas.openxmlformats.org/drawingml/2006/picture">
+                  <pic:nvPicPr>
+                    <pic:cNvPr id="1812417062" name="Picture 1"/>
+                    <pic:cNvPicPr/>
+                  </pic:nvPicPr>
+                  <pic:blipFill>
+                    <a:blip r:embed="rId19">
+                      <a:extLst>
+                        <a:ext uri="{28A0092B-C50C-407E-A947-70E740481C1C}">
+                          <a14:useLocalDpi xmlns:a14="http://schemas.microsoft.com/office/drawing/2010/main" val="0"/>
+                        </a:ext>
+                      </a:extLst>
+                    </a:blip>
+                    <a:stretch>
+                      <a:fillRect/>
+                    </a:stretch>
+                  </pic:blipFill>
+                  <pic:spPr>
+                    <a:xfrm>
+                      <a:off x="0" y="0"/>
+                      <a:ext cx="5696110" cy="4690561"/>
+                    </a:xfrm>
+                    <a:prstGeom prst="rect">
+                      <a:avLst/>
+                    </a:prstGeom>
+                  </pic:spPr>
+                </pic:pic>
+              </a:graphicData>
+            </a:graphic>
+          </wp:inline>
+        </w:drawing>
+      </w:r>
+    </w:p>
+    <w:p>
+      <w:pPr>
+        <w:pStyle w:val="Caption"/>
+      </w:pPr>
+      <w:r>
+        <w:t xml:space="preserve">Screenshot </w:t>
+      </w:r>
+      <w:r>
+        <w:fldChar w:fldCharType="begin"/>
+      </w:r>
+      <w:r>
+        <w:instrText xml:space="preserve"> SEQ Screenshot \* ARABIC </w:instrText>
+      </w:r>
+      <w:r>
+        <w:fldChar w:fldCharType="separate"/>
+      </w:r>
+      <w:r>
+        <w:rPr>
+          <w:noProof/>
+        </w:rPr>
+        <w:t>15</w:t>
+      </w:r>
+      <w:r>
+        <w:fldChar w:fldCharType="end"/>
+      </w:r>
+      <w:r>
+        <w:t>. Tooltip in action</w:t>
+      </w:r>
+    </w:p>
+    <w:p>
+      <w:r>
+        <w:br w:type="page"/>
+      </w:r>
+    </w:p>
+    <w:p>
+      <w:pPr>
+        <w:pStyle w:val="Heading1"/>
+      </w:pPr>
+      <w:r>
+        <w:lastRenderedPageBreak/>
+        <w:t>CUSTOM R SCRIPT VISUAL</w:t>
+      </w:r>
+    </w:p>
+    <w:p>
+      <w:r>
+        <w:t>A custom visual was created using R scripting to analyze sales amount distribution across all orders. Rather than using Power BI's default visuals, an R-based histogram provides more detailed statistical analysis and customization options that standard visuals cannot offer.</w:t>
+      </w:r>
+    </w:p>
+    <w:p>
+      <w:pPr>
+        <w:rPr>
+          <w:b/>
+          <w:bCs/>
+        </w:rPr>
+      </w:pPr>
+      <w:r>
+        <w:rPr>
+          <w:b/>
+          <w:bCs/>
+        </w:rPr>
+        <w:t>What Was Built</w:t>
+      </w:r>
+    </w:p>
+    <w:p>
+      <w:r>
+        <w:t>A histogram visual displaying the distribution of sales amounts across individual orders. The visual includes:</w:t>
+      </w:r>
+    </w:p>
+    <w:p>
+      <w:pPr>
+        <w:pStyle w:val="ListParagraph"/>
+        <w:numPr>
+          <w:ilvl w:val="0"/>
+          <w:numId w:val="23"/>
+        </w:numPr>
+      </w:pPr>
+      <w:r>
+        <w:t>A frequency histogram showing how many orders fall into each sales amount range</w:t>
+      </w:r>
+    </w:p>
+    <w:p>
+      <w:pPr>
+        <w:pStyle w:val="ListParagraph"/>
+        <w:numPr>
+          <w:ilvl w:val="0"/>
+          <w:numId w:val="23"/>
+        </w:numPr>
+      </w:pPr>
+      <w:r>
+        <w:t>A red dashed line indicating the mean sales amount</w:t>
+      </w:r>
+    </w:p>
+    <w:p>
+      <w:pPr>
+        <w:pStyle w:val="ListParagraph"/>
+        <w:numPr>
+          <w:ilvl w:val="0"/>
+          <w:numId w:val="23"/>
+        </w:numPr>
+      </w:pPr>
+      <w:r>
+        <w:t>A legend displaying the calculated mean value</w:t>
+      </w:r>
+    </w:p>
+    <w:p>
+      <w:pPr>
+        <w:pStyle w:val="ListParagraph"/>
+        <w:numPr>
+          <w:ilvl w:val="0"/>
+          <w:numId w:val="23"/>
+        </w:numPr>
+      </w:pPr>
+      <w:r>
+        <w:t>Grid lines for easier data reading</w:t>
+      </w:r>
+    </w:p>
+    <w:p>
+      <w:pPr>
+        <w:rPr>
+          <w:b/>
+          <w:bCs/>
+        </w:rPr>
+      </w:pPr>
+      <w:r>
+        <w:rPr>
+          <w:b/>
+          <w:bCs/>
+        </w:rPr>
+        <w:t>Method Chosen: R Script Visual</w:t>
+      </w:r>
+    </w:p>
+    <w:p>
+      <w:r>
+        <w:t>Power BI's R scripting capability allows integration of custom R code to create visualizations beyond default chart types. The implementation process involved:</w:t>
+      </w:r>
+    </w:p>
+    <w:p>
+      <w:pPr>
+        <w:pStyle w:val="ListParagraph"/>
+        <w:numPr>
+          <w:ilvl w:val="0"/>
+          <w:numId w:val="24"/>
+        </w:numPr>
+      </w:pPr>
+      <w:r>
+        <w:t>Inserting an R script visual from the Visualizations pane</w:t>
+      </w:r>
+    </w:p>
+    <w:p>
+      <w:pPr>
+        <w:pStyle w:val="ListParagraph"/>
+        <w:numPr>
+          <w:ilvl w:val="0"/>
+          <w:numId w:val="24"/>
+        </w:numPr>
+      </w:pPr>
+      <w:r>
+        <w:t>Adding data fields to the Values area (OrderQuantity, SalesAmount, YearMonthLabel)</w:t>
+      </w:r>
+    </w:p>
+    <w:p>
+      <w:pPr>
+        <w:pStyle w:val="ListParagraph"/>
+        <w:numPr>
+          <w:ilvl w:val="0"/>
+          <w:numId w:val="24"/>
+        </w:numPr>
+      </w:pPr>
+      <w:r>
+        <w:t>Writing R code using base graphics to create a histogram with statistical overlays</w:t>
+      </w:r>
+    </w:p>
+    <w:p>
+      <w:pPr>
+        <w:pStyle w:val="ListParagraph"/>
+        <w:numPr>
+          <w:ilvl w:val="0"/>
+          <w:numId w:val="24"/>
+        </w:numPr>
+      </w:pPr>
+      <w:r>
+        <w:t>Executing the script to render the custom visualization</w:t>
+      </w:r>
+    </w:p>
+    <w:p>
+      <w:pPr>
+        <w:rPr>
+          <w:b/>
+          <w:bCs/>
+        </w:rPr>
+      </w:pPr>
+      <w:r>
+        <w:rPr>
+          <w:b/>
+          <w:bCs/>
+        </w:rPr>
+        <w:t>Why This Approach</w:t>
+      </w:r>
+    </w:p>
+    <w:p>
+      <w:r>
+        <w:t>Standard Power BI visuals like bar charts show individual data points, but they don't reveal underlying statistical distributions. A histogram groups sales amounts into ranges (bins) and shows frequency, making patterns immediately visible. The mean line overlay provides context</w:t>
+      </w:r>
+      <w:r>
+        <w:t xml:space="preserve">, </w:t>
+      </w:r>
+      <w:r>
+        <w:t>users can quickly see whether most orders cluster above or below average sales value.</w:t>
+      </w:r>
+    </w:p>
+    <w:p>
+      <w:pPr>
+        <w:rPr>
+          <w:b/>
+          <w:bCs/>
+        </w:rPr>
+      </w:pPr>
+      <w:r>
+        <w:rPr>
+          <w:b/>
+          <w:bCs/>
+        </w:rPr>
+        <w:t>Usage and Benefits</w:t>
+      </w:r>
+    </w:p>
+    <w:p>
+      <w:r>
+        <w:t>Distribution Analysis: The histogram reveals that sales amounts follow a right-skewed distribution, with most orders clustered in the lower-to-mid range and fewer high-value orders.</w:t>
+      </w:r>
+    </w:p>
+    <w:p/>
+    <w:p>
+      <w:r>
+        <w:lastRenderedPageBreak/>
+        <w:t xml:space="preserve">Statistical Context: The mean line at 772,597 </w:t>
+      </w:r>
+      <w:r>
+        <w:t>₾</w:t>
+      </w:r>
+      <w:r>
+        <w:t xml:space="preserve"> </w:t>
+      </w:r>
+      <w:r>
+        <w:t>shows that typical orders fall below this average, indicating the presence of some very large orders pulling the average upward.</w:t>
+      </w:r>
+    </w:p>
+    <w:p>
+      <w:pPr>
+        <w:rPr>
+          <w:b/>
+          <w:bCs/>
+        </w:rPr>
+      </w:pPr>
+      <w:r>
+        <w:rPr>
+          <w:b/>
+          <w:bCs/>
+        </w:rPr>
+        <w:t>Code Used</w:t>
+      </w:r>
+    </w:p>
+    <w:p>
+      <w:pPr>
+        <w:shd w:val="clear" w:color="auto" w:fill="F2F2F2" w:themeFill="background1" w:themeFillShade="F2"/>
+        <w:spacing w:after="0" w:line="240" w:lineRule="auto"/>
+        <w:rPr>
+          <w:rFonts w:ascii="Consolas" w:hAnsi="Consolas"/>
+        </w:rPr>
+      </w:pPr>
+      <w:r>
+        <w:rPr>
+          <w:rFonts w:ascii="Consolas" w:hAnsi="Consolas"/>
+        </w:rPr>
+        <w:t># Clean data</w:t>
+      </w:r>
+    </w:p>
+    <w:p>
+      <w:pPr>
+        <w:shd w:val="clear" w:color="auto" w:fill="F2F2F2" w:themeFill="background1" w:themeFillShade="F2"/>
+        <w:spacing w:after="0" w:line="240" w:lineRule="auto"/>
+        <w:rPr>
+          <w:rFonts w:ascii="Consolas" w:hAnsi="Consolas"/>
+        </w:rPr>
+      </w:pPr>
+      <w:r>
+        <w:rPr>
+          <w:rFonts w:ascii="Consolas" w:hAnsi="Consolas"/>
+        </w:rPr>
+        <w:t>clean_data &lt;- dataset[complete.cases(dataset), ]</w:t>
+      </w:r>
+    </w:p>
+    <w:p>
+      <w:pPr>
+        <w:shd w:val="clear" w:color="auto" w:fill="F2F2F2" w:themeFill="background1" w:themeFillShade="F2"/>
+        <w:spacing w:after="0" w:line="240" w:lineRule="auto"/>
+        <w:rPr>
+          <w:rFonts w:ascii="Consolas" w:hAnsi="Consolas"/>
+        </w:rPr>
+      </w:pPr>
+    </w:p>
+    <w:p>
+      <w:pPr>
+        <w:shd w:val="clear" w:color="auto" w:fill="F2F2F2" w:themeFill="background1" w:themeFillShade="F2"/>
+        <w:spacing w:after="0" w:line="240" w:lineRule="auto"/>
+        <w:rPr>
+          <w:rFonts w:ascii="Consolas" w:hAnsi="Consolas"/>
+        </w:rPr>
+      </w:pPr>
+      <w:r>
+        <w:rPr>
+          <w:rFonts w:ascii="Consolas" w:hAnsi="Consolas"/>
+        </w:rPr>
+        <w:t># Create histogram instead of bar chart (better for distribution)</w:t>
+      </w:r>
+    </w:p>
+    <w:p>
+      <w:pPr>
+        <w:shd w:val="clear" w:color="auto" w:fill="F2F2F2" w:themeFill="background1" w:themeFillShade="F2"/>
+        <w:spacing w:after="0" w:line="240" w:lineRule="auto"/>
+        <w:rPr>
+          <w:rFonts w:ascii="Consolas" w:hAnsi="Consolas"/>
+        </w:rPr>
+      </w:pPr>
+      <w:r>
+        <w:rPr>
+          <w:rFonts w:ascii="Consolas" w:hAnsi="Consolas"/>
+        </w:rPr>
+        <w:t>hist(clean_data$SalesAmount,</w:t>
+      </w:r>
+    </w:p>
+    <w:p>
+      <w:pPr>
+        <w:shd w:val="clear" w:color="auto" w:fill="F2F2F2" w:themeFill="background1" w:themeFillShade="F2"/>
+        <w:spacing w:after="0" w:line="240" w:lineRule="auto"/>
+        <w:rPr>
+          <w:rFonts w:ascii="Consolas" w:hAnsi="Consolas"/>
+        </w:rPr>
+      </w:pPr>
+      <w:r>
+        <w:rPr>
+          <w:rFonts w:ascii="Consolas" w:hAnsi="Consolas"/>
+        </w:rPr>
+        <w:t xml:space="preserve">     main="Sales Amount Distribution Across Orders",</w:t>
+      </w:r>
+    </w:p>
+    <w:p>
+      <w:pPr>
+        <w:shd w:val="clear" w:color="auto" w:fill="F2F2F2" w:themeFill="background1" w:themeFillShade="F2"/>
+        <w:spacing w:after="0" w:line="240" w:lineRule="auto"/>
+        <w:rPr>
+          <w:rFonts w:ascii="Consolas" w:hAnsi="Consolas"/>
+        </w:rPr>
+      </w:pPr>
+      <w:r>
+        <w:rPr>
+          <w:rFonts w:ascii="Consolas" w:hAnsi="Consolas"/>
+        </w:rPr>
+        <w:t xml:space="preserve">     xlab="Sales Amount (€)",</w:t>
+      </w:r>
+    </w:p>
+    <w:p>
+      <w:pPr>
+        <w:shd w:val="clear" w:color="auto" w:fill="F2F2F2" w:themeFill="background1" w:themeFillShade="F2"/>
+        <w:spacing w:after="0" w:line="240" w:lineRule="auto"/>
+        <w:rPr>
+          <w:rFonts w:ascii="Consolas" w:hAnsi="Consolas"/>
+        </w:rPr>
+      </w:pPr>
+      <w:r>
+        <w:rPr>
+          <w:rFonts w:ascii="Consolas" w:hAnsi="Consolas"/>
+        </w:rPr>
+        <w:t xml:space="preserve">     ylab="Frequency (Number of Orders)",</w:t>
+      </w:r>
+    </w:p>
+    <w:p>
+      <w:pPr>
+        <w:shd w:val="clear" w:color="auto" w:fill="F2F2F2" w:themeFill="background1" w:themeFillShade="F2"/>
+        <w:spacing w:after="0" w:line="240" w:lineRule="auto"/>
+        <w:rPr>
+          <w:rFonts w:ascii="Consolas" w:hAnsi="Consolas"/>
+        </w:rPr>
+      </w:pPr>
+      <w:r>
+        <w:rPr>
+          <w:rFonts w:ascii="Consolas" w:hAnsi="Consolas"/>
+        </w:rPr>
+        <w:t xml:space="preserve">     col="steelblue",</w:t>
+      </w:r>
+    </w:p>
+    <w:p>
+      <w:pPr>
+        <w:shd w:val="clear" w:color="auto" w:fill="F2F2F2" w:themeFill="background1" w:themeFillShade="F2"/>
+        <w:spacing w:after="0" w:line="240" w:lineRule="auto"/>
+        <w:rPr>
+          <w:rFonts w:ascii="Consolas" w:hAnsi="Consolas"/>
+        </w:rPr>
+      </w:pPr>
+      <w:r>
+        <w:rPr>
+          <w:rFonts w:ascii="Consolas" w:hAnsi="Consolas"/>
+        </w:rPr>
+        <w:t xml:space="preserve">     border="darkblue",</w:t>
+      </w:r>
+    </w:p>
+    <w:p>
+      <w:pPr>
+        <w:shd w:val="clear" w:color="auto" w:fill="F2F2F2" w:themeFill="background1" w:themeFillShade="F2"/>
+        <w:spacing w:after="0" w:line="240" w:lineRule="auto"/>
+        <w:rPr>
+          <w:rFonts w:ascii="Consolas" w:hAnsi="Consolas"/>
+        </w:rPr>
+      </w:pPr>
+      <w:r>
+        <w:rPr>
+          <w:rFonts w:ascii="Consolas" w:hAnsi="Consolas"/>
+        </w:rPr>
+        <w:t xml:space="preserve">     breaks=30,</w:t>
+      </w:r>
+    </w:p>
+    <w:p>
+      <w:pPr>
+        <w:shd w:val="clear" w:color="auto" w:fill="F2F2F2" w:themeFill="background1" w:themeFillShade="F2"/>
+        <w:spacing w:after="0" w:line="240" w:lineRule="auto"/>
+        <w:rPr>
+          <w:rFonts w:ascii="Consolas" w:hAnsi="Consolas"/>
+        </w:rPr>
+      </w:pPr>
+      <w:r>
+        <w:rPr>
+          <w:rFonts w:ascii="Consolas" w:hAnsi="Consolas"/>
+        </w:rPr>
+        <w:t xml:space="preserve">     las=1)</w:t>
+      </w:r>
+    </w:p>
+    <w:p>
+      <w:pPr>
+        <w:shd w:val="clear" w:color="auto" w:fill="F2F2F2" w:themeFill="background1" w:themeFillShade="F2"/>
+        <w:spacing w:after="0" w:line="240" w:lineRule="auto"/>
+        <w:rPr>
+          <w:rFonts w:ascii="Consolas" w:hAnsi="Consolas"/>
+        </w:rPr>
+      </w:pPr>
+    </w:p>
+    <w:p>
+      <w:pPr>
+        <w:shd w:val="clear" w:color="auto" w:fill="F2F2F2" w:themeFill="background1" w:themeFillShade="F2"/>
+        <w:spacing w:after="0" w:line="240" w:lineRule="auto"/>
+        <w:rPr>
+          <w:rFonts w:ascii="Consolas" w:hAnsi="Consolas"/>
+        </w:rPr>
+      </w:pPr>
+      <w:r>
+        <w:rPr>
+          <w:rFonts w:ascii="Consolas" w:hAnsi="Consolas"/>
+        </w:rPr>
+        <w:t># Add a vertical line for the mean</w:t>
+      </w:r>
+    </w:p>
+    <w:p>
+      <w:pPr>
+        <w:shd w:val="clear" w:color="auto" w:fill="F2F2F2" w:themeFill="background1" w:themeFillShade="F2"/>
+        <w:spacing w:after="0" w:line="240" w:lineRule="auto"/>
+        <w:rPr>
+          <w:rFonts w:ascii="Consolas" w:hAnsi="Consolas"/>
+        </w:rPr>
+      </w:pPr>
+      <w:r>
+        <w:rPr>
+          <w:rFonts w:ascii="Consolas" w:hAnsi="Consolas"/>
+        </w:rPr>
+        <w:t>mean_sales &lt;- mean(clean_data$SalesAmount, na.rm=TRUE)</w:t>
+      </w:r>
+    </w:p>
+    <w:p>
+      <w:pPr>
+        <w:shd w:val="clear" w:color="auto" w:fill="F2F2F2" w:themeFill="background1" w:themeFillShade="F2"/>
+        <w:spacing w:after="0" w:line="240" w:lineRule="auto"/>
+        <w:rPr>
+          <w:rFonts w:ascii="Consolas" w:hAnsi="Consolas"/>
+        </w:rPr>
+      </w:pPr>
+      <w:r>
+        <w:rPr>
+          <w:rFonts w:ascii="Consolas" w:hAnsi="Consolas"/>
+        </w:rPr>
+        <w:t>abline(v=mean_sales, col="red", lwd=2, lty=2)</w:t>
+      </w:r>
+    </w:p>
+    <w:p>
+      <w:pPr>
+        <w:shd w:val="clear" w:color="auto" w:fill="F2F2F2" w:themeFill="background1" w:themeFillShade="F2"/>
+        <w:spacing w:after="0" w:line="240" w:lineRule="auto"/>
+        <w:rPr>
+          <w:rFonts w:ascii="Consolas" w:hAnsi="Consolas"/>
+        </w:rPr>
+      </w:pPr>
+    </w:p>
+    <w:p>
+      <w:pPr>
+        <w:shd w:val="clear" w:color="auto" w:fill="F2F2F2" w:themeFill="background1" w:themeFillShade="F2"/>
+        <w:spacing w:after="0" w:line="240" w:lineRule="auto"/>
+        <w:rPr>
+          <w:rFonts w:ascii="Consolas" w:hAnsi="Consolas"/>
+        </w:rPr>
+      </w:pPr>
+      <w:r>
+        <w:rPr>
+          <w:rFonts w:ascii="Consolas" w:hAnsi="Consolas"/>
+        </w:rPr>
+        <w:t># Add legend</w:t>
+      </w:r>
+    </w:p>
+    <w:p>
+      <w:pPr>
+        <w:shd w:val="clear" w:color="auto" w:fill="F2F2F2" w:themeFill="background1" w:themeFillShade="F2"/>
+        <w:spacing w:after="0" w:line="240" w:lineRule="auto"/>
+        <w:rPr>
+          <w:rFonts w:ascii="Consolas" w:hAnsi="Consolas"/>
+        </w:rPr>
+      </w:pPr>
+      <w:r>
+        <w:rPr>
+          <w:rFonts w:ascii="Consolas" w:hAnsi="Consolas"/>
+        </w:rPr>
+        <w:t xml:space="preserve">legend("topright", </w:t>
+      </w:r>
+    </w:p>
+    <w:p>
+      <w:pPr>
+        <w:shd w:val="clear" w:color="auto" w:fill="F2F2F2" w:themeFill="background1" w:themeFillShade="F2"/>
+        <w:spacing w:after="0" w:line="240" w:lineRule="auto"/>
+        <w:rPr>
+          <w:rFonts w:ascii="Consolas" w:hAnsi="Consolas"/>
+        </w:rPr>
+      </w:pPr>
+      <w:r>
+        <w:rPr>
+          <w:rFonts w:ascii="Consolas" w:hAnsi="Consolas"/>
+        </w:rPr>
+        <w:t xml:space="preserve">       legend=c(paste("Mean: €", round(mean_sales, 0))),</w:t>
+      </w:r>
+    </w:p>
+    <w:p>
+      <w:pPr>
+        <w:shd w:val="clear" w:color="auto" w:fill="F2F2F2" w:themeFill="background1" w:themeFillShade="F2"/>
+        <w:spacing w:after="0" w:line="240" w:lineRule="auto"/>
+        <w:rPr>
+          <w:rFonts w:ascii="Consolas" w:hAnsi="Consolas"/>
+        </w:rPr>
+      </w:pPr>
+      <w:r>
+        <w:rPr>
+          <w:rFonts w:ascii="Consolas" w:hAnsi="Consolas"/>
+        </w:rPr>
+        <w:t xml:space="preserve">       col=c("red"),</w:t>
+      </w:r>
+    </w:p>
+    <w:p>
+      <w:pPr>
+        <w:shd w:val="clear" w:color="auto" w:fill="F2F2F2" w:themeFill="background1" w:themeFillShade="F2"/>
+        <w:spacing w:after="0" w:line="240" w:lineRule="auto"/>
+        <w:rPr>
+          <w:rFonts w:ascii="Consolas" w:hAnsi="Consolas"/>
+        </w:rPr>
+      </w:pPr>
+      <w:r>
+        <w:rPr>
+          <w:rFonts w:ascii="Consolas" w:hAnsi="Consolas"/>
+        </w:rPr>
+        <w:t xml:space="preserve">       lty=c(2),</w:t>
+      </w:r>
+    </w:p>
+    <w:p>
+      <w:pPr>
+        <w:shd w:val="clear" w:color="auto" w:fill="F2F2F2" w:themeFill="background1" w:themeFillShade="F2"/>
+        <w:spacing w:after="0" w:line="240" w:lineRule="auto"/>
+        <w:rPr>
+          <w:rFonts w:ascii="Consolas" w:hAnsi="Consolas"/>
+        </w:rPr>
+      </w:pPr>
+      <w:r>
+        <w:rPr>
+          <w:rFonts w:ascii="Consolas" w:hAnsi="Consolas"/>
+        </w:rPr>
+        <w:t xml:space="preserve">       lwd=c(2),</w:t>
+      </w:r>
+    </w:p>
+    <w:p>
+      <w:pPr>
+        <w:shd w:val="clear" w:color="auto" w:fill="F2F2F2" w:themeFill="background1" w:themeFillShade="F2"/>
+        <w:spacing w:after="0" w:line="240" w:lineRule="auto"/>
+        <w:rPr>
+          <w:rFonts w:ascii="Consolas" w:hAnsi="Consolas"/>
+        </w:rPr>
+      </w:pPr>
+      <w:r>
+        <w:rPr>
+          <w:rFonts w:ascii="Consolas" w:hAnsi="Consolas"/>
+        </w:rPr>
+        <w:t xml:space="preserve">       bg="white",</w:t>
+      </w:r>
+    </w:p>
+    <w:p>
+      <w:pPr>
+        <w:shd w:val="clear" w:color="auto" w:fill="F2F2F2" w:themeFill="background1" w:themeFillShade="F2"/>
+        <w:spacing w:after="0" w:line="240" w:lineRule="auto"/>
+        <w:rPr>
+          <w:rFonts w:ascii="Consolas" w:hAnsi="Consolas"/>
+        </w:rPr>
+      </w:pPr>
+      <w:r>
+        <w:rPr>
+          <w:rFonts w:ascii="Consolas" w:hAnsi="Consolas"/>
+        </w:rPr>
+        <w:t xml:space="preserve">       box.col="gray")</w:t>
+      </w:r>
+    </w:p>
+    <w:p>
+      <w:pPr>
+        <w:shd w:val="clear" w:color="auto" w:fill="F2F2F2" w:themeFill="background1" w:themeFillShade="F2"/>
+        <w:spacing w:after="0" w:line="240" w:lineRule="auto"/>
+        <w:rPr>
+          <w:rFonts w:ascii="Consolas" w:hAnsi="Consolas"/>
+        </w:rPr>
+      </w:pPr>
+    </w:p>
+    <w:p>
+      <w:pPr>
+        <w:shd w:val="clear" w:color="auto" w:fill="F2F2F2" w:themeFill="background1" w:themeFillShade="F2"/>
+        <w:spacing w:after="0" w:line="240" w:lineRule="auto"/>
+        <w:rPr>
+          <w:rFonts w:ascii="Consolas" w:hAnsi="Consolas"/>
+        </w:rPr>
+      </w:pPr>
+      <w:r>
+        <w:rPr>
+          <w:rFonts w:ascii="Consolas" w:hAnsi="Consolas"/>
+        </w:rPr>
+        <w:t># Add grid</w:t>
+      </w:r>
+    </w:p>
+    <w:p>
+      <w:pPr>
+        <w:shd w:val="clear" w:color="auto" w:fill="F2F2F2" w:themeFill="background1" w:themeFillShade="F2"/>
+        <w:spacing w:after="0" w:line="240" w:lineRule="auto"/>
+        <w:rPr>
+          <w:rFonts w:ascii="Consolas" w:hAnsi="Consolas"/>
+        </w:rPr>
+      </w:pPr>
+      <w:r>
+        <w:rPr>
+          <w:rFonts w:ascii="Consolas" w:hAnsi="Consolas"/>
+        </w:rPr>
+        <w:t>grid(col="lightgray", lty=3, nx=NA)</w:t>
+      </w:r>
+    </w:p>
+    <w:p/>
+    <w:p>
+      <w:r>
+        <w:t>The visual was built using R's base graphics library with the following logic:</w:t>
+      </w:r>
+    </w:p>
+    <w:p>
+      <w:pPr>
+        <w:pStyle w:val="ListParagraph"/>
+        <w:numPr>
+          <w:ilvl w:val="0"/>
+          <w:numId w:val="25"/>
+        </w:numPr>
+      </w:pPr>
+      <w:r>
+        <w:t>Data cleaning (removing missing values)</w:t>
+      </w:r>
+    </w:p>
+    <w:p>
+      <w:pPr>
+        <w:pStyle w:val="ListParagraph"/>
+        <w:numPr>
+          <w:ilvl w:val="0"/>
+          <w:numId w:val="25"/>
+        </w:numPr>
+      </w:pPr>
+      <w:r>
+        <w:t>Histogram creation with 30 bins</w:t>
+      </w:r>
+    </w:p>
+    <w:p>
+      <w:pPr>
+        <w:pStyle w:val="ListParagraph"/>
+        <w:numPr>
+          <w:ilvl w:val="0"/>
+          <w:numId w:val="25"/>
+        </w:numPr>
+      </w:pPr>
+      <w:r>
+        <w:t>Mean calculation and overlay line</w:t>
+      </w:r>
+    </w:p>
+    <w:p>
+      <w:pPr>
+        <w:pStyle w:val="ListParagraph"/>
+        <w:numPr>
+          <w:ilvl w:val="0"/>
+          <w:numId w:val="25"/>
+        </w:numPr>
+      </w:pPr>
+      <w:r>
+        <w:t>Legend and grid for clarity</w:t>
+      </w:r>
+    </w:p>
+    <w:p>
+      <w:pPr>
+        <w:keepNext/>
+      </w:pPr>
+      <w:r>
+        <w:lastRenderedPageBreak/>
+        <w:drawing>
+          <wp:inline distT="0" distB="0" distL="0" distR="0" wp14:anchorId="41333BFD" wp14:editId="0A05C0A1">
+            <wp:extent cx="5943600" cy="4836795"/>
+            <wp:effectExtent l="0" t="0" r="0" b="1905"/>
+            <wp:docPr id="1105471281" name="Picture 1"/>
+            <wp:cNvGraphicFramePr>
+              <a:graphicFrameLocks xmlns:a="http://schemas.openxmlformats.org/drawingml/2006/main" noChangeAspect="1"/>
+            </wp:cNvGraphicFramePr>
+            <a:graphic xmlns:a="http://schemas.openxmlformats.org/drawingml/2006/main">
+              <a:graphicData uri="http://schemas.openxmlformats.org/drawingml/2006/picture">
+                <pic:pic xmlns:pic="http://schemas.openxmlformats.org/drawingml/2006/picture">
+                  <pic:nvPicPr>
+                    <pic:cNvPr id="1105471281" name=""/>
+                    <pic:cNvPicPr/>
+                  </pic:nvPicPr>
+                  <pic:blipFill>
+                    <a:blip r:embed="rId20"/>
+                    <a:stretch>
+                      <a:fillRect/>
+                    </a:stretch>
+                  </pic:blipFill>
+                  <pic:spPr>
+                    <a:xfrm>
+                      <a:off x="0" y="0"/>
+                      <a:ext cx="5943600" cy="4836795"/>
+                    </a:xfrm>
+                    <a:prstGeom prst="rect">
+                      <a:avLst/>
+                    </a:prstGeom>
+                  </pic:spPr>
+                </pic:pic>
+              </a:graphicData>
+            </a:graphic>
+          </wp:inline>
+        </w:drawing>
+      </w:r>
+    </w:p>
+    <w:p>
+      <w:pPr>
+        <w:pStyle w:val="Caption"/>
+      </w:pPr>
+      <w:r>
+        <w:t xml:space="preserve">Screenshot </w:t>
+      </w:r>
+      <w:r>
+        <w:fldChar w:fldCharType="begin"/>
+      </w:r>
+      <w:r>
+        <w:instrText xml:space="preserve"> SEQ Screenshot \* ARABIC </w:instrText>
+      </w:r>
+      <w:r>
+        <w:fldChar w:fldCharType="separate"/>
+      </w:r>
+      <w:r>
+        <w:rPr>
+          <w:noProof/>
+        </w:rPr>
+        <w:t>16</w:t>
+      </w:r>
+      <w:r>
+        <w:fldChar w:fldCharType="end"/>
+      </w:r>
+      <w:r>
+        <w:t xml:space="preserve">. </w:t>
+      </w:r>
+      <w:r>
+        <w:t xml:space="preserve">Custom R Visual </w:t>
+      </w:r>
+      <w:r>
+        <w:t>-</w:t>
+      </w:r>
+      <w:r>
+        <w:t xml:space="preserve"> Sales Amount Distribution Histogram</w:t>
+      </w:r>
+    </w:p>
+    <w:p>
+      <w:pPr>
+        <w:rPr>
+          <w:rFonts w:eastAsia="Times New Roman" w:cs="Calibri"/>
+          <w:b/>
+          <w:snapToGrid w:val="0"/>
+          <w:kern w:val="28"/>
+          <w:sz w:val="28"/>
+        </w:rPr>
+      </w:pPr>
+      <w:r>
+        <w:br w:type="page"/>
+      </w:r>
+    </w:p>
+    <w:p>
+      <w:pPr>
+        <w:pStyle w:val="Heading1"/>
+      </w:pPr>
+      <w:r>
+        <w:lastRenderedPageBreak/>
+        <w:t>CONCLUSION</w:t>
+      </w:r>
+    </w:p>
+    <w:p>
+      <w:r>
+        <w:t>Task 4 demonstrated the implementation of advanced Power BI reporting techniques</w:t>
+      </w:r>
+      <w:r>
+        <w:t xml:space="preserve">. </w:t>
+      </w:r>
+      <w:r>
+        <w:t>The implementation of Row Level Security ensures data confidentiality across different user roles, while Bookmarks and Buttons provide intuitive navigation without page clutter. Dynamic time period switching through MTD/QTD/YTD measures enables flexible analysis, the Decomposition Tree facilitates exploratory data discovery across multiple dimensions, and custom tooltips deliver contextual insights on demand. The custom R script visual showcases the ability to extend Power BI's native capabilities with statistical analysis, demonstrating that complex analytical requirements can be met through scripting and customization. Collectively, these features create a professional, interactive, and secure reporting solution that serves both operational and analytical needs.</w:t>
       </w:r>
     </w:p>
     <w:sectPr>
@@ -1046,6 +3097,119 @@
     </w:lvl>
   </w:abstractNum>
   <w:abstractNum w:abstractNumId="1" w15:restartNumberingAfterBreak="0">
+    <w:nsid w:val="03603640"/>
+    <w:multiLevelType w:val="hybridMultilevel"/>
+    <w:tmpl w:val="E5C2FD38"/>
+    <w:lvl w:ilvl="0" w:tplc="04090001">
+      <w:start w:val="1"/>
+      <w:numFmt w:val="bullet"/>
+      <w:lvlText w:val=""/>
+      <w:lvlJc w:val="left"/>
+      <w:pPr>
+        <w:ind w:left="720" w:hanging="360"/>
+      </w:pPr>
+      <w:rPr>
+        <w:rFonts w:ascii="Symbol" w:hAnsi="Symbol" w:hint="default"/>
+      </w:rPr>
+    </w:lvl>
+    <w:lvl w:ilvl="1" w:tplc="04090003" w:tentative="1">
+      <w:start w:val="1"/>
+      <w:numFmt w:val="bullet"/>
+      <w:lvlText w:val="o"/>
+      <w:lvlJc w:val="left"/>
+      <w:pPr>
+        <w:ind w:left="1440" w:hanging="360"/>
+      </w:pPr>
+      <w:rPr>
+        <w:rFonts w:ascii="Courier New" w:hAnsi="Courier New" w:cs="Courier New" w:hint="default"/>
+      </w:rPr>
+    </w:lvl>
+    <w:lvl w:ilvl="2" w:tplc="04090005" w:tentative="1">
+      <w:start w:val="1"/>
+      <w:numFmt w:val="bullet"/>
+      <w:lvlText w:val=""/>
+      <w:lvlJc w:val="left"/>
+      <w:pPr>
+        <w:ind w:left="2160" w:hanging="360"/>
+      </w:pPr>
+      <w:rPr>
+        <w:rFonts w:ascii="Wingdings" w:hAnsi="Wingdings" w:hint="default"/>
+      </w:rPr>
+    </w:lvl>
+    <w:lvl w:ilvl="3" w:tplc="04090001" w:tentative="1">
+      <w:start w:val="1"/>
+      <w:numFmt w:val="bullet"/>
+      <w:lvlText w:val=""/>
+      <w:lvlJc w:val="left"/>
+      <w:pPr>
+        <w:ind w:left="2880" w:hanging="360"/>
+      </w:pPr>
+      <w:rPr>
+        <w:rFonts w:ascii="Symbol" w:hAnsi="Symbol" w:hint="default"/>
+      </w:rPr>
+    </w:lvl>
+    <w:lvl w:ilvl="4" w:tplc="04090003" w:tentative="1">
+      <w:start w:val="1"/>
+      <w:numFmt w:val="bullet"/>
+      <w:lvlText w:val="o"/>
+      <w:lvlJc w:val="left"/>
+      <w:pPr>
+        <w:ind w:left="3600" w:hanging="360"/>
+      </w:pPr>
+      <w:rPr>
+        <w:rFonts w:ascii="Courier New" w:hAnsi="Courier New" w:cs="Courier New" w:hint="default"/>
+      </w:rPr>
+    </w:lvl>
+    <w:lvl w:ilvl="5" w:tplc="04090005" w:tentative="1">
+      <w:start w:val="1"/>
+      <w:numFmt w:val="bullet"/>
+      <w:lvlText w:val=""/>
+      <w:lvlJc w:val="left"/>
+      <w:pPr>
+        <w:ind w:left="4320" w:hanging="360"/>
+      </w:pPr>
+      <w:rPr>
+        <w:rFonts w:ascii="Wingdings" w:hAnsi="Wingdings" w:hint="default"/>
+      </w:rPr>
+    </w:lvl>
+    <w:lvl w:ilvl="6" w:tplc="04090001" w:tentative="1">
+      <w:start w:val="1"/>
+      <w:numFmt w:val="bullet"/>
+      <w:lvlText w:val=""/>
+      <w:lvlJc w:val="left"/>
+      <w:pPr>
+        <w:ind w:left="5040" w:hanging="360"/>
+      </w:pPr>
+      <w:rPr>
+        <w:rFonts w:ascii="Symbol" w:hAnsi="Symbol" w:hint="default"/>
+      </w:rPr>
+    </w:lvl>
+    <w:lvl w:ilvl="7" w:tplc="04090003" w:tentative="1">
+      <w:start w:val="1"/>
+      <w:numFmt w:val="bullet"/>
+      <w:lvlText w:val="o"/>
+      <w:lvlJc w:val="left"/>
+      <w:pPr>
+        <w:ind w:left="5760" w:hanging="360"/>
+      </w:pPr>
+      <w:rPr>
+        <w:rFonts w:ascii="Courier New" w:hAnsi="Courier New" w:cs="Courier New" w:hint="default"/>
+      </w:rPr>
+    </w:lvl>
+    <w:lvl w:ilvl="8" w:tplc="04090005" w:tentative="1">
+      <w:start w:val="1"/>
+      <w:numFmt w:val="bullet"/>
+      <w:lvlText w:val=""/>
+      <w:lvlJc w:val="left"/>
+      <w:pPr>
+        <w:ind w:left="6480" w:hanging="360"/>
+      </w:pPr>
+      <w:rPr>
+        <w:rFonts w:ascii="Wingdings" w:hAnsi="Wingdings" w:hint="default"/>
+      </w:rPr>
+    </w:lvl>
+  </w:abstractNum>
+  <w:abstractNum w:abstractNumId="2" w15:restartNumberingAfterBreak="0">
     <w:nsid w:val="04D051B8"/>
     <w:multiLevelType w:val="hybridMultilevel"/>
     <w:tmpl w:val="A70031F2"/>
@@ -1158,7 +3322,7 @@
       </w:rPr>
     </w:lvl>
   </w:abstractNum>
-  <w:abstractNum w:abstractNumId="2" w15:restartNumberingAfterBreak="0">
+  <w:abstractNum w:abstractNumId="3" w15:restartNumberingAfterBreak="0">
     <w:nsid w:val="04D75BFB"/>
     <w:multiLevelType w:val="hybridMultilevel"/>
     <w:tmpl w:val="D3CA7A80"/>
@@ -1271,7 +3435,151 @@
       </w:rPr>
     </w:lvl>
   </w:abstractNum>
-  <w:abstractNum w:abstractNumId="3" w15:restartNumberingAfterBreak="0">
+  <w:abstractNum w:abstractNumId="4" w15:restartNumberingAfterBreak="0">
+    <w:nsid w:val="06C30B56"/>
+    <w:multiLevelType w:val="multilevel"/>
+    <w:tmpl w:val="9746ECF6"/>
+    <w:lvl w:ilvl="0">
+      <w:start w:val="1"/>
+      <w:numFmt w:val="decimal"/>
+      <w:pStyle w:val="Heading1"/>
+      <w:lvlText w:val="%1"/>
+      <w:lvlJc w:val="left"/>
+      <w:pPr>
+        <w:tabs>
+          <w:tab w:val="num" w:pos="432"/>
+        </w:tabs>
+        <w:ind w:left="432" w:hanging="432"/>
+      </w:pPr>
+      <w:rPr>
+        <w:rFonts w:hint="default"/>
+      </w:rPr>
+    </w:lvl>
+    <w:lvl w:ilvl="1">
+      <w:start w:val="1"/>
+      <w:numFmt w:val="decimal"/>
+      <w:lvlText w:val="%1.%2"/>
+      <w:lvlJc w:val="left"/>
+      <w:pPr>
+        <w:tabs>
+          <w:tab w:val="num" w:pos="717"/>
+        </w:tabs>
+        <w:ind w:left="717" w:hanging="576"/>
+      </w:pPr>
+      <w:rPr>
+        <w:rFonts w:ascii="Calibri" w:hAnsi="Calibri" w:cs="Calibri" w:hint="default"/>
+        <w:b w:val="0"/>
+        <w:i/>
+        <w:sz w:val="28"/>
+      </w:rPr>
+    </w:lvl>
+    <w:lvl w:ilvl="2">
+      <w:start w:val="1"/>
+      <w:numFmt w:val="decimal"/>
+      <w:lvlText w:val="%1.%2.%3"/>
+      <w:lvlJc w:val="left"/>
+      <w:pPr>
+        <w:tabs>
+          <w:tab w:val="num" w:pos="720"/>
+        </w:tabs>
+        <w:ind w:left="720" w:hanging="720"/>
+      </w:pPr>
+      <w:rPr>
+        <w:rFonts w:hint="default"/>
+      </w:rPr>
+    </w:lvl>
+    <w:lvl w:ilvl="3">
+      <w:start w:val="1"/>
+      <w:numFmt w:val="decimal"/>
+      <w:lvlText w:val="%1.%2.%3.%4"/>
+      <w:lvlJc w:val="left"/>
+      <w:pPr>
+        <w:tabs>
+          <w:tab w:val="num" w:pos="864"/>
+        </w:tabs>
+        <w:ind w:left="864" w:hanging="864"/>
+      </w:pPr>
+      <w:rPr>
+        <w:rFonts w:hint="default"/>
+      </w:rPr>
+    </w:lvl>
+    <w:lvl w:ilvl="4">
+      <w:start w:val="1"/>
+      <w:numFmt w:val="decimal"/>
+      <w:lvlText w:val="%1.%2.%3.%4.%5"/>
+      <w:lvlJc w:val="left"/>
+      <w:pPr>
+        <w:tabs>
+          <w:tab w:val="num" w:pos="1008"/>
+        </w:tabs>
+        <w:ind w:left="1008" w:hanging="1008"/>
+      </w:pPr>
+      <w:rPr>
+        <w:rFonts w:hint="default"/>
+      </w:rPr>
+    </w:lvl>
+    <w:lvl w:ilvl="5">
+      <w:start w:val="1"/>
+      <w:numFmt w:val="decimal"/>
+      <w:lvlText w:val="%1.%2.%3.%4.%5.%6"/>
+      <w:lvlJc w:val="left"/>
+      <w:pPr>
+        <w:tabs>
+          <w:tab w:val="num" w:pos="1152"/>
+        </w:tabs>
+        <w:ind w:left="1152" w:hanging="1152"/>
+      </w:pPr>
+      <w:rPr>
+        <w:rFonts w:hint="default"/>
+      </w:rPr>
+    </w:lvl>
+    <w:lvl w:ilvl="6">
+      <w:start w:val="1"/>
+      <w:numFmt w:val="decimal"/>
+      <w:lvlText w:val="%1.%2.%3.%4.%5.%6.%7"/>
+      <w:lvlJc w:val="left"/>
+      <w:pPr>
+        <w:tabs>
+          <w:tab w:val="num" w:pos="1296"/>
+        </w:tabs>
+        <w:ind w:left="1296" w:hanging="1296"/>
+      </w:pPr>
+      <w:rPr>
+        <w:rFonts w:hint="default"/>
+      </w:rPr>
+    </w:lvl>
+    <w:lvl w:ilvl="7">
+      <w:start w:val="1"/>
+      <w:numFmt w:val="decimal"/>
+      <w:lvlText w:val="%1.%2.%3.%4.%5.%6.%7.%8"/>
+      <w:lvlJc w:val="left"/>
+      <w:pPr>
+        <w:tabs>
+          <w:tab w:val="num" w:pos="1440"/>
+        </w:tabs>
+        <w:ind w:left="1440" w:hanging="1440"/>
+      </w:pPr>
+      <w:rPr>
+        <w:rFonts w:hint="default"/>
+      </w:rPr>
+    </w:lvl>
+    <w:lvl w:ilvl="8">
+      <w:start w:val="1"/>
+      <w:numFmt w:val="decimal"/>
+      <w:lvlText w:val="%1.%2.%3.%4.%5.%6.%7.%8.%9"/>
+      <w:lvlJc w:val="left"/>
+      <w:pPr>
+        <w:tabs>
+          <w:tab w:val="num" w:pos="1584"/>
+        </w:tabs>
+        <w:ind w:left="1584" w:hanging="1584"/>
+      </w:pPr>
+      <w:rPr>
+        <w:rFonts w:hint="default"/>
+      </w:rPr>
+    </w:lvl>
+  </w:abstractNum>
+  <w:abstractNum w:abstractNumId="5" w15:restartNumberingAfterBreak="0">
     <w:nsid w:val="0FD06470"/>
     <w:multiLevelType w:val="hybridMultilevel"/>
     <w:tmpl w:val="DC1EEA6E"/>
@@ -1384,7 +3692,357 @@
       </w:rPr>
     </w:lvl>
   </w:abstractNum>
-  <w:abstractNum w:abstractNumId="4" w15:restartNumberingAfterBreak="0">
+  <w:abstractNum w:abstractNumId="6" w15:restartNumberingAfterBreak="0">
+    <w:nsid w:val="108A1E73"/>
+    <w:multiLevelType w:val="hybridMultilevel"/>
+    <w:tmpl w:val="3C98211A"/>
+    <w:lvl w:ilvl="0" w:tplc="04090001">
+      <w:start w:val="1"/>
+      <w:numFmt w:val="bullet"/>
+      <w:lvlText w:val=""/>
+      <w:lvlJc w:val="left"/>
+      <w:pPr>
+        <w:ind w:left="1080" w:hanging="360"/>
+      </w:pPr>
+      <w:rPr>
+        <w:rFonts w:ascii="Symbol" w:hAnsi="Symbol" w:hint="default"/>
+      </w:rPr>
+    </w:lvl>
+    <w:lvl w:ilvl="1" w:tplc="FFFFFFFF" w:tentative="1">
+      <w:start w:val="1"/>
+      <w:numFmt w:val="lowerLetter"/>
+      <w:lvlText w:val="%2."/>
+      <w:lvlJc w:val="left"/>
+      <w:pPr>
+        <w:ind w:left="1800" w:hanging="360"/>
+      </w:pPr>
+    </w:lvl>
+    <w:lvl w:ilvl="2" w:tplc="FFFFFFFF" w:tentative="1">
+      <w:start w:val="1"/>
+      <w:numFmt w:val="lowerRoman"/>
+      <w:lvlText w:val="%3."/>
+      <w:lvlJc w:val="right"/>
+      <w:pPr>
+        <w:ind w:left="2520" w:hanging="180"/>
+      </w:pPr>
+    </w:lvl>
+    <w:lvl w:ilvl="3" w:tplc="FFFFFFFF" w:tentative="1">
+      <w:start w:val="1"/>
+      <w:numFmt w:val="decimal"/>
+      <w:lvlText w:val="%4."/>
+      <w:lvlJc w:val="left"/>
+      <w:pPr>
+        <w:ind w:left="3240" w:hanging="360"/>
+      </w:pPr>
+    </w:lvl>
+    <w:lvl w:ilvl="4" w:tplc="FFFFFFFF" w:tentative="1">
+      <w:start w:val="1"/>
+      <w:numFmt w:val="lowerLetter"/>
+      <w:lvlText w:val="%5."/>
+      <w:lvlJc w:val="left"/>
+      <w:pPr>
+        <w:ind w:left="3960" w:hanging="360"/>
+      </w:pPr>
+    </w:lvl>
+    <w:lvl w:ilvl="5" w:tplc="FFFFFFFF" w:tentative="1">
+      <w:start w:val="1"/>
+      <w:numFmt w:val="lowerRoman"/>
+      <w:lvlText w:val="%6."/>
+      <w:lvlJc w:val="right"/>
+      <w:pPr>
+        <w:ind w:left="4680" w:hanging="180"/>
+      </w:pPr>
+    </w:lvl>
+    <w:lvl w:ilvl="6" w:tplc="FFFFFFFF" w:tentative="1">
+      <w:start w:val="1"/>
+      <w:numFmt w:val="decimal"/>
+      <w:lvlText w:val="%7."/>
+      <w:lvlJc w:val="left"/>
+      <w:pPr>
+        <w:ind w:left="5400" w:hanging="360"/>
+      </w:pPr>
+    </w:lvl>
+    <w:lvl w:ilvl="7" w:tplc="FFFFFFFF" w:tentative="1">
+      <w:start w:val="1"/>
+      <w:numFmt w:val="lowerLetter"/>
+      <w:lvlText w:val="%8."/>
+      <w:lvlJc w:val="left"/>
+      <w:pPr>
+        <w:ind w:left="6120" w:hanging="360"/>
+      </w:pPr>
+    </w:lvl>
+    <w:lvl w:ilvl="8" w:tplc="FFFFFFFF" w:tentative="1">
+      <w:start w:val="1"/>
+      <w:numFmt w:val="lowerRoman"/>
+      <w:lvlText w:val="%9."/>
+      <w:lvlJc w:val="right"/>
+      <w:pPr>
+        <w:ind w:left="6840" w:hanging="180"/>
+      </w:pPr>
+    </w:lvl>
+  </w:abstractNum>
+  <w:abstractNum w:abstractNumId="7" w15:restartNumberingAfterBreak="0">
+    <w:nsid w:val="1FDC6A33"/>
+    <w:multiLevelType w:val="hybridMultilevel"/>
+    <w:tmpl w:val="D722F13A"/>
+    <w:lvl w:ilvl="0" w:tplc="0409000F">
+      <w:start w:val="1"/>
+      <w:numFmt w:val="decimal"/>
+      <w:lvlText w:val="%1."/>
+      <w:lvlJc w:val="left"/>
+      <w:pPr>
+        <w:ind w:left="720" w:hanging="360"/>
+      </w:pPr>
+    </w:lvl>
+    <w:lvl w:ilvl="1" w:tplc="04090019" w:tentative="1">
+      <w:start w:val="1"/>
+      <w:numFmt w:val="lowerLetter"/>
+      <w:lvlText w:val="%2."/>
+      <w:lvlJc w:val="left"/>
+      <w:pPr>
+        <w:ind w:left="1440" w:hanging="360"/>
+      </w:pPr>
+    </w:lvl>
+    <w:lvl w:ilvl="2" w:tplc="0409001B" w:tentative="1">
+      <w:start w:val="1"/>
+      <w:numFmt w:val="lowerRoman"/>
+      <w:lvlText w:val="%3."/>
+      <w:lvlJc w:val="right"/>
+      <w:pPr>
+        <w:ind w:left="2160" w:hanging="180"/>
+      </w:pPr>
+    </w:lvl>
+    <w:lvl w:ilvl="3" w:tplc="0409000F" w:tentative="1">
+      <w:start w:val="1"/>
+      <w:numFmt w:val="decimal"/>
+      <w:lvlText w:val="%4."/>
+      <w:lvlJc w:val="left"/>
+      <w:pPr>
+        <w:ind w:left="2880" w:hanging="360"/>
+      </w:pPr>
+    </w:lvl>
+    <w:lvl w:ilvl="4" w:tplc="04090019" w:tentative="1">
+      <w:start w:val="1"/>
+      <w:numFmt w:val="lowerLetter"/>
+      <w:lvlText w:val="%5."/>
+      <w:lvlJc w:val="left"/>
+      <w:pPr>
+        <w:ind w:left="3600" w:hanging="360"/>
+      </w:pPr>
+    </w:lvl>
+    <w:lvl w:ilvl="5" w:tplc="0409001B" w:tentative="1">
+      <w:start w:val="1"/>
+      <w:numFmt w:val="lowerRoman"/>
+      <w:lvlText w:val="%6."/>
+      <w:lvlJc w:val="right"/>
+      <w:pPr>
+        <w:ind w:left="4320" w:hanging="180"/>
+      </w:pPr>
+    </w:lvl>
+    <w:lvl w:ilvl="6" w:tplc="0409000F" w:tentative="1">
+      <w:start w:val="1"/>
+      <w:numFmt w:val="decimal"/>
+      <w:lvlText w:val="%7."/>
+      <w:lvlJc w:val="left"/>
+      <w:pPr>
+        <w:ind w:left="5040" w:hanging="360"/>
+      </w:pPr>
+    </w:lvl>
+    <w:lvl w:ilvl="7" w:tplc="04090019" w:tentative="1">
+      <w:start w:val="1"/>
+      <w:numFmt w:val="lowerLetter"/>
+      <w:lvlText w:val="%8."/>
+      <w:lvlJc w:val="left"/>
+      <w:pPr>
+        <w:ind w:left="5760" w:hanging="360"/>
+      </w:pPr>
+    </w:lvl>
+    <w:lvl w:ilvl="8" w:tplc="0409001B" w:tentative="1">
+      <w:start w:val="1"/>
+      <w:numFmt w:val="lowerRoman"/>
+      <w:lvlText w:val="%9."/>
+      <w:lvlJc w:val="right"/>
+      <w:pPr>
+        <w:ind w:left="6480" w:hanging="180"/>
+      </w:pPr>
+    </w:lvl>
+  </w:abstractNum>
+  <w:abstractNum w:abstractNumId="8" w15:restartNumberingAfterBreak="0">
+    <w:nsid w:val="25613DCD"/>
+    <w:multiLevelType w:val="hybridMultilevel"/>
+    <w:tmpl w:val="D9AE7576"/>
+    <w:lvl w:ilvl="0" w:tplc="FFFFFFFF">
+      <w:start w:val="1"/>
+      <w:numFmt w:val="decimal"/>
+      <w:lvlText w:val="%1."/>
+      <w:lvlJc w:val="left"/>
+      <w:pPr>
+        <w:ind w:left="360" w:hanging="360"/>
+      </w:pPr>
+    </w:lvl>
+    <w:lvl w:ilvl="1" w:tplc="04090001">
+      <w:start w:val="1"/>
+      <w:numFmt w:val="bullet"/>
+      <w:lvlText w:val=""/>
+      <w:lvlJc w:val="left"/>
+      <w:pPr>
+        <w:ind w:left="360" w:hanging="360"/>
+      </w:pPr>
+      <w:rPr>
+        <w:rFonts w:ascii="Symbol" w:hAnsi="Symbol" w:hint="default"/>
+      </w:rPr>
+    </w:lvl>
+    <w:lvl w:ilvl="2" w:tplc="FFFFFFFF">
+      <w:start w:val="1"/>
+      <w:numFmt w:val="lowerRoman"/>
+      <w:lvlText w:val="%3."/>
+      <w:lvlJc w:val="right"/>
+      <w:pPr>
+        <w:ind w:left="1800" w:hanging="180"/>
+      </w:pPr>
+    </w:lvl>
+    <w:lvl w:ilvl="3" w:tplc="FFFFFFFF" w:tentative="1">
+      <w:start w:val="1"/>
+      <w:numFmt w:val="decimal"/>
+      <w:lvlText w:val="%4."/>
+      <w:lvlJc w:val="left"/>
+      <w:pPr>
+        <w:ind w:left="2520" w:hanging="360"/>
+      </w:pPr>
+    </w:lvl>
+    <w:lvl w:ilvl="4" w:tplc="FFFFFFFF" w:tentative="1">
+      <w:start w:val="1"/>
+      <w:numFmt w:val="lowerLetter"/>
+      <w:lvlText w:val="%5."/>
+      <w:lvlJc w:val="left"/>
+      <w:pPr>
+        <w:ind w:left="3240" w:hanging="360"/>
+      </w:pPr>
+    </w:lvl>
+    <w:lvl w:ilvl="5" w:tplc="FFFFFFFF" w:tentative="1">
+      <w:start w:val="1"/>
+      <w:numFmt w:val="lowerRoman"/>
+      <w:lvlText w:val="%6."/>
+      <w:lvlJc w:val="right"/>
+      <w:pPr>
+        <w:ind w:left="3960" w:hanging="180"/>
+      </w:pPr>
+    </w:lvl>
+    <w:lvl w:ilvl="6" w:tplc="FFFFFFFF" w:tentative="1">
+      <w:start w:val="1"/>
+      <w:numFmt w:val="decimal"/>
+      <w:lvlText w:val="%7."/>
+      <w:lvlJc w:val="left"/>
+      <w:pPr>
+        <w:ind w:left="4680" w:hanging="360"/>
+      </w:pPr>
+    </w:lvl>
+    <w:lvl w:ilvl="7" w:tplc="FFFFFFFF" w:tentative="1">
+      <w:start w:val="1"/>
+      <w:numFmt w:val="lowerLetter"/>
+      <w:lvlText w:val="%8."/>
+      <w:lvlJc w:val="left"/>
+      <w:pPr>
+        <w:ind w:left="5400" w:hanging="360"/>
+      </w:pPr>
+    </w:lvl>
+    <w:lvl w:ilvl="8" w:tplc="FFFFFFFF" w:tentative="1">
+      <w:start w:val="1"/>
+      <w:numFmt w:val="lowerRoman"/>
+      <w:lvlText w:val="%9."/>
+      <w:lvlJc w:val="right"/>
+      <w:pPr>
+        <w:ind w:left="6120" w:hanging="180"/>
+      </w:pPr>
+    </w:lvl>
+  </w:abstractNum>
+  <w:abstractNum w:abstractNumId="9" w15:restartNumberingAfterBreak="0">
+    <w:nsid w:val="27DC58CC"/>
+    <w:multiLevelType w:val="hybridMultilevel"/>
+    <w:tmpl w:val="CB146BC6"/>
+    <w:lvl w:ilvl="0" w:tplc="0409000F">
+      <w:start w:val="1"/>
+      <w:numFmt w:val="decimal"/>
+      <w:lvlText w:val="%1."/>
+      <w:lvlJc w:val="left"/>
+      <w:pPr>
+        <w:ind w:left="1080" w:hanging="360"/>
+      </w:pPr>
+    </w:lvl>
+    <w:lvl w:ilvl="1" w:tplc="04090019" w:tentative="1">
+      <w:start w:val="1"/>
+      <w:numFmt w:val="lowerLetter"/>
+      <w:lvlText w:val="%2."/>
+      <w:lvlJc w:val="left"/>
+      <w:pPr>
+        <w:ind w:left="1800" w:hanging="360"/>
+      </w:pPr>
+    </w:lvl>
+    <w:lvl w:ilvl="2" w:tplc="0409001B" w:tentative="1">
+      <w:start w:val="1"/>
+      <w:numFmt w:val="lowerRoman"/>
+      <w:lvlText w:val="%3."/>
+      <w:lvlJc w:val="right"/>
+      <w:pPr>
+        <w:ind w:left="2520" w:hanging="180"/>
+      </w:pPr>
+    </w:lvl>
+    <w:lvl w:ilvl="3" w:tplc="0409000F" w:tentative="1">
+      <w:start w:val="1"/>
+      <w:numFmt w:val="decimal"/>
+      <w:lvlText w:val="%4."/>
+      <w:lvlJc w:val="left"/>
+      <w:pPr>
+        <w:ind w:left="3240" w:hanging="360"/>
+      </w:pPr>
+    </w:lvl>
+    <w:lvl w:ilvl="4" w:tplc="04090019" w:tentative="1">
+      <w:start w:val="1"/>
+      <w:numFmt w:val="lowerLetter"/>
+      <w:lvlText w:val="%5."/>
+      <w:lvlJc w:val="left"/>
+      <w:pPr>
+        <w:ind w:left="3960" w:hanging="360"/>
+      </w:pPr>
+    </w:lvl>
+    <w:lvl w:ilvl="5" w:tplc="0409001B" w:tentative="1">
+      <w:start w:val="1"/>
+      <w:numFmt w:val="lowerRoman"/>
+      <w:lvlText w:val="%6."/>
+      <w:lvlJc w:val="right"/>
+      <w:pPr>
+        <w:ind w:left="4680" w:hanging="180"/>
+      </w:pPr>
+    </w:lvl>
+    <w:lvl w:ilvl="6" w:tplc="0409000F" w:tentative="1">
+      <w:start w:val="1"/>
+      <w:numFmt w:val="decimal"/>
+      <w:lvlText w:val="%7."/>
+      <w:lvlJc w:val="left"/>
+      <w:pPr>
+        <w:ind w:left="5400" w:hanging="360"/>
+      </w:pPr>
+    </w:lvl>
+    <w:lvl w:ilvl="7" w:tplc="04090019" w:tentative="1">
+      <w:start w:val="1"/>
+      <w:numFmt w:val="lowerLetter"/>
+      <w:lvlText w:val="%8."/>
+      <w:lvlJc w:val="left"/>
+      <w:pPr>
+        <w:ind w:left="6120" w:hanging="360"/>
+      </w:pPr>
+    </w:lvl>
+    <w:lvl w:ilvl="8" w:tplc="0409001B" w:tentative="1">
+      <w:start w:val="1"/>
+      <w:numFmt w:val="lowerRoman"/>
+      <w:lvlText w:val="%9."/>
+      <w:lvlJc w:val="right"/>
+      <w:pPr>
+        <w:ind w:left="6840" w:hanging="180"/>
+      </w:pPr>
+    </w:lvl>
+  </w:abstractNum>
+  <w:abstractNum w:abstractNumId="10" w15:restartNumberingAfterBreak="0">
     <w:nsid w:val="35302BB2"/>
     <w:multiLevelType w:val="hybridMultilevel"/>
     <w:tmpl w:val="2736B00E"/>
@@ -1497,7 +4155,860 @@
       </w:rPr>
     </w:lvl>
   </w:abstractNum>
-  <w:abstractNum w:abstractNumId="5" w15:restartNumberingAfterBreak="0">
+  <w:abstractNum w:abstractNumId="11" w15:restartNumberingAfterBreak="0">
+    <w:nsid w:val="40984426"/>
+    <w:multiLevelType w:val="hybridMultilevel"/>
+    <w:tmpl w:val="B4F255D2"/>
+    <w:lvl w:ilvl="0" w:tplc="04090003">
+      <w:start w:val="1"/>
+      <w:numFmt w:val="bullet"/>
+      <w:lvlText w:val="o"/>
+      <w:lvlJc w:val="left"/>
+      <w:pPr>
+        <w:ind w:left="1080" w:hanging="360"/>
+      </w:pPr>
+      <w:rPr>
+        <w:rFonts w:ascii="Courier New" w:hAnsi="Courier New" w:cs="Courier New" w:hint="default"/>
+      </w:rPr>
+    </w:lvl>
+    <w:lvl w:ilvl="1" w:tplc="FFFFFFFF" w:tentative="1">
+      <w:start w:val="1"/>
+      <w:numFmt w:val="lowerLetter"/>
+      <w:lvlText w:val="%2."/>
+      <w:lvlJc w:val="left"/>
+      <w:pPr>
+        <w:ind w:left="1800" w:hanging="360"/>
+      </w:pPr>
+    </w:lvl>
+    <w:lvl w:ilvl="2" w:tplc="FFFFFFFF" w:tentative="1">
+      <w:start w:val="1"/>
+      <w:numFmt w:val="lowerRoman"/>
+      <w:lvlText w:val="%3."/>
+      <w:lvlJc w:val="right"/>
+      <w:pPr>
+        <w:ind w:left="2520" w:hanging="180"/>
+      </w:pPr>
+    </w:lvl>
+    <w:lvl w:ilvl="3" w:tplc="FFFFFFFF" w:tentative="1">
+      <w:start w:val="1"/>
+      <w:numFmt w:val="decimal"/>
+      <w:lvlText w:val="%4."/>
+      <w:lvlJc w:val="left"/>
+      <w:pPr>
+        <w:ind w:left="3240" w:hanging="360"/>
+      </w:pPr>
+    </w:lvl>
+    <w:lvl w:ilvl="4" w:tplc="FFFFFFFF" w:tentative="1">
+      <w:start w:val="1"/>
+      <w:numFmt w:val="lowerLetter"/>
+      <w:lvlText w:val="%5."/>
+      <w:lvlJc w:val="left"/>
+      <w:pPr>
+        <w:ind w:left="3960" w:hanging="360"/>
+      </w:pPr>
+    </w:lvl>
+    <w:lvl w:ilvl="5" w:tplc="FFFFFFFF" w:tentative="1">
+      <w:start w:val="1"/>
+      <w:numFmt w:val="lowerRoman"/>
+      <w:lvlText w:val="%6."/>
+      <w:lvlJc w:val="right"/>
+      <w:pPr>
+        <w:ind w:left="4680" w:hanging="180"/>
+      </w:pPr>
+    </w:lvl>
+    <w:lvl w:ilvl="6" w:tplc="FFFFFFFF" w:tentative="1">
+      <w:start w:val="1"/>
+      <w:numFmt w:val="decimal"/>
+      <w:lvlText w:val="%7."/>
+      <w:lvlJc w:val="left"/>
+      <w:pPr>
+        <w:ind w:left="5400" w:hanging="360"/>
+      </w:pPr>
+    </w:lvl>
+    <w:lvl w:ilvl="7" w:tplc="FFFFFFFF" w:tentative="1">
+      <w:start w:val="1"/>
+      <w:numFmt w:val="lowerLetter"/>
+      <w:lvlText w:val="%8."/>
+      <w:lvlJc w:val="left"/>
+      <w:pPr>
+        <w:ind w:left="6120" w:hanging="360"/>
+      </w:pPr>
+    </w:lvl>
+    <w:lvl w:ilvl="8" w:tplc="FFFFFFFF" w:tentative="1">
+      <w:start w:val="1"/>
+      <w:numFmt w:val="lowerRoman"/>
+      <w:lvlText w:val="%9."/>
+      <w:lvlJc w:val="right"/>
+      <w:pPr>
+        <w:ind w:left="6840" w:hanging="180"/>
+      </w:pPr>
+    </w:lvl>
+  </w:abstractNum>
+  <w:abstractNum w:abstractNumId="12" w15:restartNumberingAfterBreak="0">
+    <w:nsid w:val="4FA82231"/>
+    <w:multiLevelType w:val="hybridMultilevel"/>
+    <w:tmpl w:val="CFDCBF56"/>
+    <w:lvl w:ilvl="0" w:tplc="04090003">
+      <w:start w:val="1"/>
+      <w:numFmt w:val="bullet"/>
+      <w:lvlText w:val="o"/>
+      <w:lvlJc w:val="left"/>
+      <w:pPr>
+        <w:ind w:left="720" w:hanging="360"/>
+      </w:pPr>
+      <w:rPr>
+        <w:rFonts w:ascii="Courier New" w:hAnsi="Courier New" w:cs="Courier New" w:hint="default"/>
+      </w:rPr>
+    </w:lvl>
+    <w:lvl w:ilvl="1" w:tplc="04090003" w:tentative="1">
+      <w:start w:val="1"/>
+      <w:numFmt w:val="bullet"/>
+      <w:lvlText w:val="o"/>
+      <w:lvlJc w:val="left"/>
+      <w:pPr>
+        <w:ind w:left="1440" w:hanging="360"/>
+      </w:pPr>
+      <w:rPr>
+        <w:rFonts w:ascii="Courier New" w:hAnsi="Courier New" w:cs="Courier New" w:hint="default"/>
+      </w:rPr>
+    </w:lvl>
+    <w:lvl w:ilvl="2" w:tplc="04090005" w:tentative="1">
+      <w:start w:val="1"/>
+      <w:numFmt w:val="bullet"/>
+      <w:lvlText w:val=""/>
+      <w:lvlJc w:val="left"/>
+      <w:pPr>
+        <w:ind w:left="2160" w:hanging="360"/>
+      </w:pPr>
+      <w:rPr>
+        <w:rFonts w:ascii="Wingdings" w:hAnsi="Wingdings" w:hint="default"/>
+      </w:rPr>
+    </w:lvl>
+    <w:lvl w:ilvl="3" w:tplc="04090001" w:tentative="1">
+      <w:start w:val="1"/>
+      <w:numFmt w:val="bullet"/>
+      <w:lvlText w:val=""/>
+      <w:lvlJc w:val="left"/>
+      <w:pPr>
+        <w:ind w:left="2880" w:hanging="360"/>
+      </w:pPr>
+      <w:rPr>
+        <w:rFonts w:ascii="Symbol" w:hAnsi="Symbol" w:hint="default"/>
+      </w:rPr>
+    </w:lvl>
+    <w:lvl w:ilvl="4" w:tplc="04090003" w:tentative="1">
+      <w:start w:val="1"/>
+      <w:numFmt w:val="bullet"/>
+      <w:lvlText w:val="o"/>
+      <w:lvlJc w:val="left"/>
+      <w:pPr>
+        <w:ind w:left="3600" w:hanging="360"/>
+      </w:pPr>
+      <w:rPr>
+        <w:rFonts w:ascii="Courier New" w:hAnsi="Courier New" w:cs="Courier New" w:hint="default"/>
+      </w:rPr>
+    </w:lvl>
+    <w:lvl w:ilvl="5" w:tplc="04090005" w:tentative="1">
+      <w:start w:val="1"/>
+      <w:numFmt w:val="bullet"/>
+      <w:lvlText w:val=""/>
+      <w:lvlJc w:val="left"/>
+      <w:pPr>
+        <w:ind w:left="4320" w:hanging="360"/>
+      </w:pPr>
+      <w:rPr>
+        <w:rFonts w:ascii="Wingdings" w:hAnsi="Wingdings" w:hint="default"/>
+      </w:rPr>
+    </w:lvl>
+    <w:lvl w:ilvl="6" w:tplc="04090001" w:tentative="1">
+      <w:start w:val="1"/>
+      <w:numFmt w:val="bullet"/>
+      <w:lvlText w:val=""/>
+      <w:lvlJc w:val="left"/>
+      <w:pPr>
+        <w:ind w:left="5040" w:hanging="360"/>
+      </w:pPr>
+      <w:rPr>
+        <w:rFonts w:ascii="Symbol" w:hAnsi="Symbol" w:hint="default"/>
+      </w:rPr>
+    </w:lvl>
+    <w:lvl w:ilvl="7" w:tplc="04090003" w:tentative="1">
+      <w:start w:val="1"/>
+      <w:numFmt w:val="bullet"/>
+      <w:lvlText w:val="o"/>
+      <w:lvlJc w:val="left"/>
+      <w:pPr>
+        <w:ind w:left="5760" w:hanging="360"/>
+      </w:pPr>
+      <w:rPr>
+        <w:rFonts w:ascii="Courier New" w:hAnsi="Courier New" w:cs="Courier New" w:hint="default"/>
+      </w:rPr>
+    </w:lvl>
+    <w:lvl w:ilvl="8" w:tplc="04090005" w:tentative="1">
+      <w:start w:val="1"/>
+      <w:numFmt w:val="bullet"/>
+      <w:lvlText w:val=""/>
+      <w:lvlJc w:val="left"/>
+      <w:pPr>
+        <w:ind w:left="6480" w:hanging="360"/>
+      </w:pPr>
+      <w:rPr>
+        <w:rFonts w:ascii="Wingdings" w:hAnsi="Wingdings" w:hint="default"/>
+      </w:rPr>
+    </w:lvl>
+  </w:abstractNum>
+  <w:abstractNum w:abstractNumId="13" w15:restartNumberingAfterBreak="0">
+    <w:nsid w:val="544774FD"/>
+    <w:multiLevelType w:val="hybridMultilevel"/>
+    <w:tmpl w:val="D4D6B0CC"/>
+    <w:lvl w:ilvl="0" w:tplc="04090001">
+      <w:start w:val="1"/>
+      <w:numFmt w:val="bullet"/>
+      <w:lvlText w:val=""/>
+      <w:lvlJc w:val="left"/>
+      <w:pPr>
+        <w:ind w:left="720" w:hanging="360"/>
+      </w:pPr>
+      <w:rPr>
+        <w:rFonts w:ascii="Symbol" w:hAnsi="Symbol" w:hint="default"/>
+      </w:rPr>
+    </w:lvl>
+    <w:lvl w:ilvl="1" w:tplc="04090003">
+      <w:start w:val="1"/>
+      <w:numFmt w:val="bullet"/>
+      <w:lvlText w:val="o"/>
+      <w:lvlJc w:val="left"/>
+      <w:pPr>
+        <w:ind w:left="1440" w:hanging="360"/>
+      </w:pPr>
+      <w:rPr>
+        <w:rFonts w:ascii="Courier New" w:hAnsi="Courier New" w:cs="Courier New" w:hint="default"/>
+      </w:rPr>
+    </w:lvl>
+    <w:lvl w:ilvl="2" w:tplc="04090005" w:tentative="1">
+      <w:start w:val="1"/>
+      <w:numFmt w:val="bullet"/>
+      <w:lvlText w:val=""/>
+      <w:lvlJc w:val="left"/>
+      <w:pPr>
+        <w:ind w:left="2160" w:hanging="360"/>
+      </w:pPr>
+      <w:rPr>
+        <w:rFonts w:ascii="Wingdings" w:hAnsi="Wingdings" w:hint="default"/>
+      </w:rPr>
+    </w:lvl>
+    <w:lvl w:ilvl="3" w:tplc="04090001" w:tentative="1">
+      <w:start w:val="1"/>
+      <w:numFmt w:val="bullet"/>
+      <w:lvlText w:val=""/>
+      <w:lvlJc w:val="left"/>
+      <w:pPr>
+        <w:ind w:left="2880" w:hanging="360"/>
+      </w:pPr>
+      <w:rPr>
+        <w:rFonts w:ascii="Symbol" w:hAnsi="Symbol" w:hint="default"/>
+      </w:rPr>
+    </w:lvl>
+    <w:lvl w:ilvl="4" w:tplc="04090003" w:tentative="1">
+      <w:start w:val="1"/>
+      <w:numFmt w:val="bullet"/>
+      <w:lvlText w:val="o"/>
+      <w:lvlJc w:val="left"/>
+      <w:pPr>
+        <w:ind w:left="3600" w:hanging="360"/>
+      </w:pPr>
+      <w:rPr>
+        <w:rFonts w:ascii="Courier New" w:hAnsi="Courier New" w:cs="Courier New" w:hint="default"/>
+      </w:rPr>
+    </w:lvl>
+    <w:lvl w:ilvl="5" w:tplc="04090005" w:tentative="1">
+      <w:start w:val="1"/>
+      <w:numFmt w:val="bullet"/>
+      <w:lvlText w:val=""/>
+      <w:lvlJc w:val="left"/>
+      <w:pPr>
+        <w:ind w:left="4320" w:hanging="360"/>
+      </w:pPr>
+      <w:rPr>
+        <w:rFonts w:ascii="Wingdings" w:hAnsi="Wingdings" w:hint="default"/>
+      </w:rPr>
+    </w:lvl>
+    <w:lvl w:ilvl="6" w:tplc="04090001" w:tentative="1">
+      <w:start w:val="1"/>
+      <w:numFmt w:val="bullet"/>
+      <w:lvlText w:val=""/>
+      <w:lvlJc w:val="left"/>
+      <w:pPr>
+        <w:ind w:left="5040" w:hanging="360"/>
+      </w:pPr>
+      <w:rPr>
+        <w:rFonts w:ascii="Symbol" w:hAnsi="Symbol" w:hint="default"/>
+      </w:rPr>
+    </w:lvl>
+    <w:lvl w:ilvl="7" w:tplc="04090003" w:tentative="1">
+      <w:start w:val="1"/>
+      <w:numFmt w:val="bullet"/>
+      <w:lvlText w:val="o"/>
+      <w:lvlJc w:val="left"/>
+      <w:pPr>
+        <w:ind w:left="5760" w:hanging="360"/>
+      </w:pPr>
+      <w:rPr>
+        <w:rFonts w:ascii="Courier New" w:hAnsi="Courier New" w:cs="Courier New" w:hint="default"/>
+      </w:rPr>
+    </w:lvl>
+    <w:lvl w:ilvl="8" w:tplc="04090005" w:tentative="1">
+      <w:start w:val="1"/>
+      <w:numFmt w:val="bullet"/>
+      <w:lvlText w:val=""/>
+      <w:lvlJc w:val="left"/>
+      <w:pPr>
+        <w:ind w:left="6480" w:hanging="360"/>
+      </w:pPr>
+      <w:rPr>
+        <w:rFonts w:ascii="Wingdings" w:hAnsi="Wingdings" w:hint="default"/>
+      </w:rPr>
+    </w:lvl>
+  </w:abstractNum>
+  <w:abstractNum w:abstractNumId="14" w15:restartNumberingAfterBreak="0">
+    <w:nsid w:val="54D9619C"/>
+    <w:multiLevelType w:val="hybridMultilevel"/>
+    <w:tmpl w:val="8DD80234"/>
+    <w:lvl w:ilvl="0" w:tplc="04090001">
+      <w:start w:val="1"/>
+      <w:numFmt w:val="bullet"/>
+      <w:lvlText w:val=""/>
+      <w:lvlJc w:val="left"/>
+      <w:pPr>
+        <w:ind w:left="720" w:hanging="360"/>
+      </w:pPr>
+      <w:rPr>
+        <w:rFonts w:ascii="Symbol" w:hAnsi="Symbol" w:hint="default"/>
+      </w:rPr>
+    </w:lvl>
+    <w:lvl w:ilvl="1" w:tplc="FFFFFFFF" w:tentative="1">
+      <w:start w:val="1"/>
+      <w:numFmt w:val="bullet"/>
+      <w:lvlText w:val="o"/>
+      <w:lvlJc w:val="left"/>
+      <w:pPr>
+        <w:ind w:left="1440" w:hanging="360"/>
+      </w:pPr>
+      <w:rPr>
+        <w:rFonts w:ascii="Courier New" w:hAnsi="Courier New" w:cs="Courier New" w:hint="default"/>
+      </w:rPr>
+    </w:lvl>
+    <w:lvl w:ilvl="2" w:tplc="FFFFFFFF" w:tentative="1">
+      <w:start w:val="1"/>
+      <w:numFmt w:val="bullet"/>
+      <w:lvlText w:val=""/>
+      <w:lvlJc w:val="left"/>
+      <w:pPr>
+        <w:ind w:left="2160" w:hanging="360"/>
+      </w:pPr>
+      <w:rPr>
+        <w:rFonts w:ascii="Wingdings" w:hAnsi="Wingdings" w:hint="default"/>
+      </w:rPr>
+    </w:lvl>
+    <w:lvl w:ilvl="3" w:tplc="FFFFFFFF" w:tentative="1">
+      <w:start w:val="1"/>
+      <w:numFmt w:val="bullet"/>
+      <w:lvlText w:val=""/>
+      <w:lvlJc w:val="left"/>
+      <w:pPr>
+        <w:ind w:left="2880" w:hanging="360"/>
+      </w:pPr>
+      <w:rPr>
+        <w:rFonts w:ascii="Symbol" w:hAnsi="Symbol" w:hint="default"/>
+      </w:rPr>
+    </w:lvl>
+    <w:lvl w:ilvl="4" w:tplc="FFFFFFFF" w:tentative="1">
+      <w:start w:val="1"/>
+      <w:numFmt w:val="bullet"/>
+      <w:lvlText w:val="o"/>
+      <w:lvlJc w:val="left"/>
+      <w:pPr>
+        <w:ind w:left="3600" w:hanging="360"/>
+      </w:pPr>
+      <w:rPr>
+        <w:rFonts w:ascii="Courier New" w:hAnsi="Courier New" w:cs="Courier New" w:hint="default"/>
+      </w:rPr>
+    </w:lvl>
+    <w:lvl w:ilvl="5" w:tplc="FFFFFFFF" w:tentative="1">
+      <w:start w:val="1"/>
+      <w:numFmt w:val="bullet"/>
+      <w:lvlText w:val=""/>
+      <w:lvlJc w:val="left"/>
+      <w:pPr>
+        <w:ind w:left="4320" w:hanging="360"/>
+      </w:pPr>
+      <w:rPr>
+        <w:rFonts w:ascii="Wingdings" w:hAnsi="Wingdings" w:hint="default"/>
+      </w:rPr>
+    </w:lvl>
+    <w:lvl w:ilvl="6" w:tplc="FFFFFFFF" w:tentative="1">
+      <w:start w:val="1"/>
+      <w:numFmt w:val="bullet"/>
+      <w:lvlText w:val=""/>
+      <w:lvlJc w:val="left"/>
+      <w:pPr>
+        <w:ind w:left="5040" w:hanging="360"/>
+      </w:pPr>
+      <w:rPr>
+        <w:rFonts w:ascii="Symbol" w:hAnsi="Symbol" w:hint="default"/>
+      </w:rPr>
+    </w:lvl>
+    <w:lvl w:ilvl="7" w:tplc="FFFFFFFF" w:tentative="1">
+      <w:start w:val="1"/>
+      <w:numFmt w:val="bullet"/>
+      <w:lvlText w:val="o"/>
+      <w:lvlJc w:val="left"/>
+      <w:pPr>
+        <w:ind w:left="5760" w:hanging="360"/>
+      </w:pPr>
+      <w:rPr>
+        <w:rFonts w:ascii="Courier New" w:hAnsi="Courier New" w:cs="Courier New" w:hint="default"/>
+      </w:rPr>
+    </w:lvl>
+    <w:lvl w:ilvl="8" w:tplc="FFFFFFFF" w:tentative="1">
+      <w:start w:val="1"/>
+      <w:numFmt w:val="bullet"/>
+      <w:lvlText w:val=""/>
+      <w:lvlJc w:val="left"/>
+      <w:pPr>
+        <w:ind w:left="6480" w:hanging="360"/>
+      </w:pPr>
+      <w:rPr>
+        <w:rFonts w:ascii="Wingdings" w:hAnsi="Wingdings" w:hint="default"/>
+      </w:rPr>
+    </w:lvl>
+  </w:abstractNum>
+  <w:abstractNum w:abstractNumId="15" w15:restartNumberingAfterBreak="0">
+    <w:nsid w:val="5A8E4335"/>
+    <w:multiLevelType w:val="hybridMultilevel"/>
+    <w:tmpl w:val="2EE6B62A"/>
+    <w:lvl w:ilvl="0" w:tplc="0409000F">
+      <w:start w:val="1"/>
+      <w:numFmt w:val="decimal"/>
+      <w:lvlText w:val="%1."/>
+      <w:lvlJc w:val="left"/>
+      <w:pPr>
+        <w:ind w:left="720" w:hanging="360"/>
+      </w:pPr>
+    </w:lvl>
+    <w:lvl w:ilvl="1" w:tplc="04090019">
+      <w:start w:val="1"/>
+      <w:numFmt w:val="lowerLetter"/>
+      <w:lvlText w:val="%2."/>
+      <w:lvlJc w:val="left"/>
+      <w:pPr>
+        <w:ind w:left="1440" w:hanging="360"/>
+      </w:pPr>
+    </w:lvl>
+    <w:lvl w:ilvl="2" w:tplc="0409001B" w:tentative="1">
+      <w:start w:val="1"/>
+      <w:numFmt w:val="lowerRoman"/>
+      <w:lvlText w:val="%3."/>
+      <w:lvlJc w:val="right"/>
+      <w:pPr>
+        <w:ind w:left="2160" w:hanging="180"/>
+      </w:pPr>
+    </w:lvl>
+    <w:lvl w:ilvl="3" w:tplc="0409000F" w:tentative="1">
+      <w:start w:val="1"/>
+      <w:numFmt w:val="decimal"/>
+      <w:lvlText w:val="%4."/>
+      <w:lvlJc w:val="left"/>
+      <w:pPr>
+        <w:ind w:left="2880" w:hanging="360"/>
+      </w:pPr>
+    </w:lvl>
+    <w:lvl w:ilvl="4" w:tplc="04090019" w:tentative="1">
+      <w:start w:val="1"/>
+      <w:numFmt w:val="lowerLetter"/>
+      <w:lvlText w:val="%5."/>
+      <w:lvlJc w:val="left"/>
+      <w:pPr>
+        <w:ind w:left="3600" w:hanging="360"/>
+      </w:pPr>
+    </w:lvl>
+    <w:lvl w:ilvl="5" w:tplc="0409001B" w:tentative="1">
+      <w:start w:val="1"/>
+      <w:numFmt w:val="lowerRoman"/>
+      <w:lvlText w:val="%6."/>
+      <w:lvlJc w:val="right"/>
+      <w:pPr>
+        <w:ind w:left="4320" w:hanging="180"/>
+      </w:pPr>
+    </w:lvl>
+    <w:lvl w:ilvl="6" w:tplc="0409000F" w:tentative="1">
+      <w:start w:val="1"/>
+      <w:numFmt w:val="decimal"/>
+      <w:lvlText w:val="%7."/>
+      <w:lvlJc w:val="left"/>
+      <w:pPr>
+        <w:ind w:left="5040" w:hanging="360"/>
+      </w:pPr>
+    </w:lvl>
+    <w:lvl w:ilvl="7" w:tplc="04090019" w:tentative="1">
+      <w:start w:val="1"/>
+      <w:numFmt w:val="lowerLetter"/>
+      <w:lvlText w:val="%8."/>
+      <w:lvlJc w:val="left"/>
+      <w:pPr>
+        <w:ind w:left="5760" w:hanging="360"/>
+      </w:pPr>
+    </w:lvl>
+    <w:lvl w:ilvl="8" w:tplc="0409001B" w:tentative="1">
+      <w:start w:val="1"/>
+      <w:numFmt w:val="lowerRoman"/>
+      <w:lvlText w:val="%9."/>
+      <w:lvlJc w:val="right"/>
+      <w:pPr>
+        <w:ind w:left="6480" w:hanging="180"/>
+      </w:pPr>
+    </w:lvl>
+  </w:abstractNum>
+  <w:abstractNum w:abstractNumId="16" w15:restartNumberingAfterBreak="0">
+    <w:nsid w:val="5D3E6582"/>
+    <w:multiLevelType w:val="hybridMultilevel"/>
+    <w:tmpl w:val="E1400D2E"/>
+    <w:lvl w:ilvl="0" w:tplc="04090001">
+      <w:start w:val="1"/>
+      <w:numFmt w:val="bullet"/>
+      <w:lvlText w:val=""/>
+      <w:lvlJc w:val="left"/>
+      <w:pPr>
+        <w:ind w:left="720" w:hanging="360"/>
+      </w:pPr>
+      <w:rPr>
+        <w:rFonts w:ascii="Symbol" w:hAnsi="Symbol" w:hint="default"/>
+      </w:rPr>
+    </w:lvl>
+    <w:lvl w:ilvl="1" w:tplc="04090003" w:tentative="1">
+      <w:start w:val="1"/>
+      <w:numFmt w:val="bullet"/>
+      <w:lvlText w:val="o"/>
+      <w:lvlJc w:val="left"/>
+      <w:pPr>
+        <w:ind w:left="1440" w:hanging="360"/>
+      </w:pPr>
+      <w:rPr>
+        <w:rFonts w:ascii="Courier New" w:hAnsi="Courier New" w:cs="Courier New" w:hint="default"/>
+      </w:rPr>
+    </w:lvl>
+    <w:lvl w:ilvl="2" w:tplc="04090005" w:tentative="1">
+      <w:start w:val="1"/>
+      <w:numFmt w:val="bullet"/>
+      <w:lvlText w:val=""/>
+      <w:lvlJc w:val="left"/>
+      <w:pPr>
+        <w:ind w:left="2160" w:hanging="360"/>
+      </w:pPr>
+      <w:rPr>
+        <w:rFonts w:ascii="Wingdings" w:hAnsi="Wingdings" w:hint="default"/>
+      </w:rPr>
+    </w:lvl>
+    <w:lvl w:ilvl="3" w:tplc="04090001" w:tentative="1">
+      <w:start w:val="1"/>
+      <w:numFmt w:val="bullet"/>
+      <w:lvlText w:val=""/>
+      <w:lvlJc w:val="left"/>
+      <w:pPr>
+        <w:ind w:left="2880" w:hanging="360"/>
+      </w:pPr>
+      <w:rPr>
+        <w:rFonts w:ascii="Symbol" w:hAnsi="Symbol" w:hint="default"/>
+      </w:rPr>
+    </w:lvl>
+    <w:lvl w:ilvl="4" w:tplc="04090003" w:tentative="1">
+      <w:start w:val="1"/>
+      <w:numFmt w:val="bullet"/>
+      <w:lvlText w:val="o"/>
+      <w:lvlJc w:val="left"/>
+      <w:pPr>
+        <w:ind w:left="3600" w:hanging="360"/>
+      </w:pPr>
+      <w:rPr>
+        <w:rFonts w:ascii="Courier New" w:hAnsi="Courier New" w:cs="Courier New" w:hint="default"/>
+      </w:rPr>
+    </w:lvl>
+    <w:lvl w:ilvl="5" w:tplc="04090005" w:tentative="1">
+      <w:start w:val="1"/>
+      <w:numFmt w:val="bullet"/>
+      <w:lvlText w:val=""/>
+      <w:lvlJc w:val="left"/>
+      <w:pPr>
+        <w:ind w:left="4320" w:hanging="360"/>
+      </w:pPr>
+      <w:rPr>
+        <w:rFonts w:ascii="Wingdings" w:hAnsi="Wingdings" w:hint="default"/>
+      </w:rPr>
+    </w:lvl>
+    <w:lvl w:ilvl="6" w:tplc="04090001" w:tentative="1">
+      <w:start w:val="1"/>
+      <w:numFmt w:val="bullet"/>
+      <w:lvlText w:val=""/>
+      <w:lvlJc w:val="left"/>
+      <w:pPr>
+        <w:ind w:left="5040" w:hanging="360"/>
+      </w:pPr>
+      <w:rPr>
+        <w:rFonts w:ascii="Symbol" w:hAnsi="Symbol" w:hint="default"/>
+      </w:rPr>
+    </w:lvl>
+    <w:lvl w:ilvl="7" w:tplc="04090003" w:tentative="1">
+      <w:start w:val="1"/>
+      <w:numFmt w:val="bullet"/>
+      <w:lvlText w:val="o"/>
+      <w:lvlJc w:val="left"/>
+      <w:pPr>
+        <w:ind w:left="5760" w:hanging="360"/>
+      </w:pPr>
+      <w:rPr>
+        <w:rFonts w:ascii="Courier New" w:hAnsi="Courier New" w:cs="Courier New" w:hint="default"/>
+      </w:rPr>
+    </w:lvl>
+    <w:lvl w:ilvl="8" w:tplc="04090005" w:tentative="1">
+      <w:start w:val="1"/>
+      <w:numFmt w:val="bullet"/>
+      <w:lvlText w:val=""/>
+      <w:lvlJc w:val="left"/>
+      <w:pPr>
+        <w:ind w:left="6480" w:hanging="360"/>
+      </w:pPr>
+      <w:rPr>
+        <w:rFonts w:ascii="Wingdings" w:hAnsi="Wingdings" w:hint="default"/>
+      </w:rPr>
+    </w:lvl>
+  </w:abstractNum>
+  <w:abstractNum w:abstractNumId="17" w15:restartNumberingAfterBreak="0">
+    <w:nsid w:val="60880A18"/>
+    <w:multiLevelType w:val="hybridMultilevel"/>
+    <w:tmpl w:val="B60A4192"/>
+    <w:lvl w:ilvl="0" w:tplc="0409000F">
+      <w:start w:val="1"/>
+      <w:numFmt w:val="decimal"/>
+      <w:lvlText w:val="%1."/>
+      <w:lvlJc w:val="left"/>
+      <w:pPr>
+        <w:ind w:left="720" w:hanging="360"/>
+      </w:pPr>
+      <w:rPr>
+        <w:rFonts w:hint="default"/>
+      </w:rPr>
+    </w:lvl>
+    <w:lvl w:ilvl="1" w:tplc="FFFFFFFF" w:tentative="1">
+      <w:start w:val="1"/>
+      <w:numFmt w:val="bullet"/>
+      <w:lvlText w:val="o"/>
+      <w:lvlJc w:val="left"/>
+      <w:pPr>
+        <w:ind w:left="1440" w:hanging="360"/>
+      </w:pPr>
+      <w:rPr>
+        <w:rFonts w:ascii="Courier New" w:hAnsi="Courier New" w:cs="Courier New" w:hint="default"/>
+      </w:rPr>
+    </w:lvl>
+    <w:lvl w:ilvl="2" w:tplc="FFFFFFFF" w:tentative="1">
+      <w:start w:val="1"/>
+      <w:numFmt w:val="bullet"/>
+      <w:lvlText w:val=""/>
+      <w:lvlJc w:val="left"/>
+      <w:pPr>
+        <w:ind w:left="2160" w:hanging="360"/>
+      </w:pPr>
+      <w:rPr>
+        <w:rFonts w:ascii="Wingdings" w:hAnsi="Wingdings" w:hint="default"/>
+      </w:rPr>
+    </w:lvl>
+    <w:lvl w:ilvl="3" w:tplc="FFFFFFFF" w:tentative="1">
+      <w:start w:val="1"/>
+      <w:numFmt w:val="bullet"/>
+      <w:lvlText w:val=""/>
+      <w:lvlJc w:val="left"/>
+      <w:pPr>
+        <w:ind w:left="2880" w:hanging="360"/>
+      </w:pPr>
+      <w:rPr>
+        <w:rFonts w:ascii="Symbol" w:hAnsi="Symbol" w:hint="default"/>
+      </w:rPr>
+    </w:lvl>
+    <w:lvl w:ilvl="4" w:tplc="FFFFFFFF" w:tentative="1">
+      <w:start w:val="1"/>
+      <w:numFmt w:val="bullet"/>
+      <w:lvlText w:val="o"/>
+      <w:lvlJc w:val="left"/>
+      <w:pPr>
+        <w:ind w:left="3600" w:hanging="360"/>
+      </w:pPr>
+      <w:rPr>
+        <w:rFonts w:ascii="Courier New" w:hAnsi="Courier New" w:cs="Courier New" w:hint="default"/>
+      </w:rPr>
+    </w:lvl>
+    <w:lvl w:ilvl="5" w:tplc="FFFFFFFF" w:tentative="1">
+      <w:start w:val="1"/>
+      <w:numFmt w:val="bullet"/>
+      <w:lvlText w:val=""/>
+      <w:lvlJc w:val="left"/>
+      <w:pPr>
+        <w:ind w:left="4320" w:hanging="360"/>
+      </w:pPr>
+      <w:rPr>
+        <w:rFonts w:ascii="Wingdings" w:hAnsi="Wingdings" w:hint="default"/>
+      </w:rPr>
+    </w:lvl>
+    <w:lvl w:ilvl="6" w:tplc="FFFFFFFF" w:tentative="1">
+      <w:start w:val="1"/>
+      <w:numFmt w:val="bullet"/>
+      <w:lvlText w:val=""/>
+      <w:lvlJc w:val="left"/>
+      <w:pPr>
+        <w:ind w:left="5040" w:hanging="360"/>
+      </w:pPr>
+      <w:rPr>
+        <w:rFonts w:ascii="Symbol" w:hAnsi="Symbol" w:hint="default"/>
+      </w:rPr>
+    </w:lvl>
+    <w:lvl w:ilvl="7" w:tplc="FFFFFFFF" w:tentative="1">
+      <w:start w:val="1"/>
+      <w:numFmt w:val="bullet"/>
+      <w:lvlText w:val="o"/>
+      <w:lvlJc w:val="left"/>
+      <w:pPr>
+        <w:ind w:left="5760" w:hanging="360"/>
+      </w:pPr>
+      <w:rPr>
+        <w:rFonts w:ascii="Courier New" w:hAnsi="Courier New" w:cs="Courier New" w:hint="default"/>
+      </w:rPr>
+    </w:lvl>
+    <w:lvl w:ilvl="8" w:tplc="FFFFFFFF" w:tentative="1">
+      <w:start w:val="1"/>
+      <w:numFmt w:val="bullet"/>
+      <w:lvlText w:val=""/>
+      <w:lvlJc w:val="left"/>
+      <w:pPr>
+        <w:ind w:left="6480" w:hanging="360"/>
+      </w:pPr>
+      <w:rPr>
+        <w:rFonts w:ascii="Wingdings" w:hAnsi="Wingdings" w:hint="default"/>
+      </w:rPr>
+    </w:lvl>
+  </w:abstractNum>
+  <w:abstractNum w:abstractNumId="18" w15:restartNumberingAfterBreak="0">
+    <w:nsid w:val="676C7991"/>
+    <w:multiLevelType w:val="hybridMultilevel"/>
+    <w:tmpl w:val="1E0629FA"/>
+    <w:lvl w:ilvl="0" w:tplc="04090001">
+      <w:start w:val="1"/>
+      <w:numFmt w:val="bullet"/>
+      <w:lvlText w:val=""/>
+      <w:lvlJc w:val="left"/>
+      <w:pPr>
+        <w:ind w:left="720" w:hanging="360"/>
+      </w:pPr>
+      <w:rPr>
+        <w:rFonts w:ascii="Symbol" w:hAnsi="Symbol" w:hint="default"/>
+      </w:rPr>
+    </w:lvl>
+    <w:lvl w:ilvl="1" w:tplc="04090003" w:tentative="1">
+      <w:start w:val="1"/>
+      <w:numFmt w:val="bullet"/>
+      <w:lvlText w:val="o"/>
+      <w:lvlJc w:val="left"/>
+      <w:pPr>
+        <w:ind w:left="1440" w:hanging="360"/>
+      </w:pPr>
+      <w:rPr>
+        <w:rFonts w:ascii="Courier New" w:hAnsi="Courier New" w:cs="Courier New" w:hint="default"/>
+      </w:rPr>
+    </w:lvl>
+    <w:lvl w:ilvl="2" w:tplc="04090005" w:tentative="1">
+      <w:start w:val="1"/>
+      <w:numFmt w:val="bullet"/>
+      <w:lvlText w:val=""/>
+      <w:lvlJc w:val="left"/>
+      <w:pPr>
+        <w:ind w:left="2160" w:hanging="360"/>
+      </w:pPr>
+      <w:rPr>
+        <w:rFonts w:ascii="Wingdings" w:hAnsi="Wingdings" w:hint="default"/>
+      </w:rPr>
+    </w:lvl>
+    <w:lvl w:ilvl="3" w:tplc="04090001" w:tentative="1">
+      <w:start w:val="1"/>
+      <w:numFmt w:val="bullet"/>
+      <w:lvlText w:val=""/>
+      <w:lvlJc w:val="left"/>
+      <w:pPr>
+        <w:ind w:left="2880" w:hanging="360"/>
+      </w:pPr>
+      <w:rPr>
+        <w:rFonts w:ascii="Symbol" w:hAnsi="Symbol" w:hint="default"/>
+      </w:rPr>
+    </w:lvl>
+    <w:lvl w:ilvl="4" w:tplc="04090003" w:tentative="1">
+      <w:start w:val="1"/>
+      <w:numFmt w:val="bullet"/>
+      <w:lvlText w:val="o"/>
+      <w:lvlJc w:val="left"/>
+      <w:pPr>
+        <w:ind w:left="3600" w:hanging="360"/>
+      </w:pPr>
+      <w:rPr>
+        <w:rFonts w:ascii="Courier New" w:hAnsi="Courier New" w:cs="Courier New" w:hint="default"/>
+      </w:rPr>
+    </w:lvl>
+    <w:lvl w:ilvl="5" w:tplc="04090005" w:tentative="1">
+      <w:start w:val="1"/>
+      <w:numFmt w:val="bullet"/>
+      <w:lvlText w:val=""/>
+      <w:lvlJc w:val="left"/>
+      <w:pPr>
+        <w:ind w:left="4320" w:hanging="360"/>
+      </w:pPr>
+      <w:rPr>
+        <w:rFonts w:ascii="Wingdings" w:hAnsi="Wingdings" w:hint="default"/>
+      </w:rPr>
+    </w:lvl>
+    <w:lvl w:ilvl="6" w:tplc="04090001" w:tentative="1">
+      <w:start w:val="1"/>
+      <w:numFmt w:val="bullet"/>
+      <w:lvlText w:val=""/>
+      <w:lvlJc w:val="left"/>
+      <w:pPr>
+        <w:ind w:left="5040" w:hanging="360"/>
+      </w:pPr>
+      <w:rPr>
+        <w:rFonts w:ascii="Symbol" w:hAnsi="Symbol" w:hint="default"/>
+      </w:rPr>
+    </w:lvl>
+    <w:lvl w:ilvl="7" w:tplc="04090003" w:tentative="1">
+      <w:start w:val="1"/>
+      <w:numFmt w:val="bullet"/>
+      <w:lvlText w:val="o"/>
+      <w:lvlJc w:val="left"/>
+      <w:pPr>
+        <w:ind w:left="5760" w:hanging="360"/>
+      </w:pPr>
+      <w:rPr>
+        <w:rFonts w:ascii="Courier New" w:hAnsi="Courier New" w:cs="Courier New" w:hint="default"/>
+      </w:rPr>
+    </w:lvl>
+    <w:lvl w:ilvl="8" w:tplc="04090005" w:tentative="1">
+      <w:start w:val="1"/>
+      <w:numFmt w:val="bullet"/>
+      <w:lvlText w:val=""/>
+      <w:lvlJc w:val="left"/>
+      <w:pPr>
+        <w:ind w:left="6480" w:hanging="360"/>
+      </w:pPr>
+      <w:rPr>
+        <w:rFonts w:ascii="Wingdings" w:hAnsi="Wingdings" w:hint="default"/>
+      </w:rPr>
+    </w:lvl>
+  </w:abstractNum>
+  <w:abstractNum w:abstractNumId="19" w15:restartNumberingAfterBreak="0">
     <w:nsid w:val="693F544A"/>
     <w:multiLevelType w:val="hybridMultilevel"/>
     <w:tmpl w:val="A91C2B72"/>
@@ -1610,14 +5121,13 @@
       </w:rPr>
     </w:lvl>
   </w:abstractNum>
-  <w:abstractNum w:abstractNumId="6" w15:restartNumberingAfterBreak="0">
+  <w:abstractNum w:abstractNumId="20" w15:restartNumberingAfterBreak="0">
     <w:nsid w:val="6F6374AB"/>
     <w:multiLevelType w:val="multilevel"/>
-    <w:tmpl w:val="69E26A94"/>
+    <w:tmpl w:val="39A8440A"/>
     <w:lvl w:ilvl="0">
       <w:start w:val="1"/>
       <w:numFmt w:val="decimal"/>
-      <w:pStyle w:val="Heading1"/>
       <w:lvlText w:val="%1"/>
       <w:lvlJc w:val="left"/>
       <w:pPr>
@@ -1730,7 +5240,120 @@
       </w:pPr>
     </w:lvl>
   </w:abstractNum>
-  <w:abstractNum w:abstractNumId="7" w15:restartNumberingAfterBreak="0">
+  <w:abstractNum w:abstractNumId="21" w15:restartNumberingAfterBreak="0">
+    <w:nsid w:val="702751B1"/>
+    <w:multiLevelType w:val="hybridMultilevel"/>
+    <w:tmpl w:val="8BFA7DEC"/>
+    <w:lvl w:ilvl="0" w:tplc="04090001">
+      <w:start w:val="1"/>
+      <w:numFmt w:val="bullet"/>
+      <w:lvlText w:val=""/>
+      <w:lvlJc w:val="left"/>
+      <w:pPr>
+        <w:ind w:left="720" w:hanging="360"/>
+      </w:pPr>
+      <w:rPr>
+        <w:rFonts w:ascii="Symbol" w:hAnsi="Symbol" w:hint="default"/>
+      </w:rPr>
+    </w:lvl>
+    <w:lvl w:ilvl="1" w:tplc="04090003" w:tentative="1">
+      <w:start w:val="1"/>
+      <w:numFmt w:val="bullet"/>
+      <w:lvlText w:val="o"/>
+      <w:lvlJc w:val="left"/>
+      <w:pPr>
+        <w:ind w:left="1440" w:hanging="360"/>
+      </w:pPr>
+      <w:rPr>
+        <w:rFonts w:ascii="Courier New" w:hAnsi="Courier New" w:cs="Courier New" w:hint="default"/>
+      </w:rPr>
+    </w:lvl>
+    <w:lvl w:ilvl="2" w:tplc="04090005" w:tentative="1">
+      <w:start w:val="1"/>
+      <w:numFmt w:val="bullet"/>
+      <w:lvlText w:val=""/>
+      <w:lvlJc w:val="left"/>
+      <w:pPr>
+        <w:ind w:left="2160" w:hanging="360"/>
+      </w:pPr>
+      <w:rPr>
+        <w:rFonts w:ascii="Wingdings" w:hAnsi="Wingdings" w:hint="default"/>
+      </w:rPr>
+    </w:lvl>
+    <w:lvl w:ilvl="3" w:tplc="04090001" w:tentative="1">
+      <w:start w:val="1"/>
+      <w:numFmt w:val="bullet"/>
+      <w:lvlText w:val=""/>
+      <w:lvlJc w:val="left"/>
+      <w:pPr>
+        <w:ind w:left="2880" w:hanging="360"/>
+      </w:pPr>
+      <w:rPr>
+        <w:rFonts w:ascii="Symbol" w:hAnsi="Symbol" w:hint="default"/>
+      </w:rPr>
+    </w:lvl>
+    <w:lvl w:ilvl="4" w:tplc="04090003" w:tentative="1">
+      <w:start w:val="1"/>
+      <w:numFmt w:val="bullet"/>
+      <w:lvlText w:val="o"/>
+      <w:lvlJc w:val="left"/>
+      <w:pPr>
+        <w:ind w:left="3600" w:hanging="360"/>
+      </w:pPr>
+      <w:rPr>
+        <w:rFonts w:ascii="Courier New" w:hAnsi="Courier New" w:cs="Courier New" w:hint="default"/>
+      </w:rPr>
+    </w:lvl>
+    <w:lvl w:ilvl="5" w:tplc="04090005" w:tentative="1">
+      <w:start w:val="1"/>
+      <w:numFmt w:val="bullet"/>
+      <w:lvlText w:val=""/>
+      <w:lvlJc w:val="left"/>
+      <w:pPr>
+        <w:ind w:left="4320" w:hanging="360"/>
+      </w:pPr>
+      <w:rPr>
+        <w:rFonts w:ascii="Wingdings" w:hAnsi="Wingdings" w:hint="default"/>
+      </w:rPr>
+    </w:lvl>
+    <w:lvl w:ilvl="6" w:tplc="04090001" w:tentative="1">
+      <w:start w:val="1"/>
+      <w:numFmt w:val="bullet"/>
+      <w:lvlText w:val=""/>
+      <w:lvlJc w:val="left"/>
+      <w:pPr>
+        <w:ind w:left="5040" w:hanging="360"/>
+      </w:pPr>
+      <w:rPr>
+        <w:rFonts w:ascii="Symbol" w:hAnsi="Symbol" w:hint="default"/>
+      </w:rPr>
+    </w:lvl>
+    <w:lvl w:ilvl="7" w:tplc="04090003" w:tentative="1">
+      <w:start w:val="1"/>
+      <w:numFmt w:val="bullet"/>
+      <w:lvlText w:val="o"/>
+      <w:lvlJc w:val="left"/>
+      <w:pPr>
+        <w:ind w:left="5760" w:hanging="360"/>
+      </w:pPr>
+      <w:rPr>
+        <w:rFonts w:ascii="Courier New" w:hAnsi="Courier New" w:cs="Courier New" w:hint="default"/>
+      </w:rPr>
+    </w:lvl>
+    <w:lvl w:ilvl="8" w:tplc="04090005" w:tentative="1">
+      <w:start w:val="1"/>
+      <w:numFmt w:val="bullet"/>
+      <w:lvlText w:val=""/>
+      <w:lvlJc w:val="left"/>
+      <w:pPr>
+        <w:ind w:left="6480" w:hanging="360"/>
+      </w:pPr>
+      <w:rPr>
+        <w:rFonts w:ascii="Wingdings" w:hAnsi="Wingdings" w:hint="default"/>
+      </w:rPr>
+    </w:lvl>
+  </w:abstractNum>
+  <w:abstractNum w:abstractNumId="22" w15:restartNumberingAfterBreak="0">
     <w:nsid w:val="71470B71"/>
     <w:multiLevelType w:val="hybridMultilevel"/>
     <w:tmpl w:val="2F16D134"/>
@@ -1843,7 +5466,7 @@
       </w:rPr>
     </w:lvl>
   </w:abstractNum>
-  <w:abstractNum w:abstractNumId="8" w15:restartNumberingAfterBreak="0">
+  <w:abstractNum w:abstractNumId="23" w15:restartNumberingAfterBreak="0">
     <w:nsid w:val="7585340B"/>
     <w:multiLevelType w:val="hybridMultilevel"/>
     <w:tmpl w:val="82324140"/>
@@ -1956,32 +5579,288 @@
       </w:rPr>
     </w:lvl>
   </w:abstractNum>
+  <w:abstractNum w:abstractNumId="24" w15:restartNumberingAfterBreak="0">
+    <w:nsid w:val="7A863CB0"/>
+    <w:multiLevelType w:val="hybridMultilevel"/>
+    <w:tmpl w:val="BF2A2C02"/>
+    <w:lvl w:ilvl="0" w:tplc="04090001">
+      <w:start w:val="1"/>
+      <w:numFmt w:val="bullet"/>
+      <w:lvlText w:val=""/>
+      <w:lvlJc w:val="left"/>
+      <w:pPr>
+        <w:ind w:left="720" w:hanging="360"/>
+      </w:pPr>
+      <w:rPr>
+        <w:rFonts w:ascii="Symbol" w:hAnsi="Symbol" w:hint="default"/>
+      </w:rPr>
+    </w:lvl>
+    <w:lvl w:ilvl="1" w:tplc="04090003" w:tentative="1">
+      <w:start w:val="1"/>
+      <w:numFmt w:val="bullet"/>
+      <w:lvlText w:val="o"/>
+      <w:lvlJc w:val="left"/>
+      <w:pPr>
+        <w:ind w:left="1440" w:hanging="360"/>
+      </w:pPr>
+      <w:rPr>
+        <w:rFonts w:ascii="Courier New" w:hAnsi="Courier New" w:cs="Courier New" w:hint="default"/>
+      </w:rPr>
+    </w:lvl>
+    <w:lvl w:ilvl="2" w:tplc="04090005" w:tentative="1">
+      <w:start w:val="1"/>
+      <w:numFmt w:val="bullet"/>
+      <w:lvlText w:val=""/>
+      <w:lvlJc w:val="left"/>
+      <w:pPr>
+        <w:ind w:left="2160" w:hanging="360"/>
+      </w:pPr>
+      <w:rPr>
+        <w:rFonts w:ascii="Wingdings" w:hAnsi="Wingdings" w:hint="default"/>
+      </w:rPr>
+    </w:lvl>
+    <w:lvl w:ilvl="3" w:tplc="04090001" w:tentative="1">
+      <w:start w:val="1"/>
+      <w:numFmt w:val="bullet"/>
+      <w:lvlText w:val=""/>
+      <w:lvlJc w:val="left"/>
+      <w:pPr>
+        <w:ind w:left="2880" w:hanging="360"/>
+      </w:pPr>
+      <w:rPr>
+        <w:rFonts w:ascii="Symbol" w:hAnsi="Symbol" w:hint="default"/>
+      </w:rPr>
+    </w:lvl>
+    <w:lvl w:ilvl="4" w:tplc="04090003" w:tentative="1">
+      <w:start w:val="1"/>
+      <w:numFmt w:val="bullet"/>
+      <w:lvlText w:val="o"/>
+      <w:lvlJc w:val="left"/>
+      <w:pPr>
+        <w:ind w:left="3600" w:hanging="360"/>
+      </w:pPr>
+      <w:rPr>
+        <w:rFonts w:ascii="Courier New" w:hAnsi="Courier New" w:cs="Courier New" w:hint="default"/>
+      </w:rPr>
+    </w:lvl>
+    <w:lvl w:ilvl="5" w:tplc="04090005" w:tentative="1">
+      <w:start w:val="1"/>
+      <w:numFmt w:val="bullet"/>
+      <w:lvlText w:val=""/>
+      <w:lvlJc w:val="left"/>
+      <w:pPr>
+        <w:ind w:left="4320" w:hanging="360"/>
+      </w:pPr>
+      <w:rPr>
+        <w:rFonts w:ascii="Wingdings" w:hAnsi="Wingdings" w:hint="default"/>
+      </w:rPr>
+    </w:lvl>
+    <w:lvl w:ilvl="6" w:tplc="04090001" w:tentative="1">
+      <w:start w:val="1"/>
+      <w:numFmt w:val="bullet"/>
+      <w:lvlText w:val=""/>
+      <w:lvlJc w:val="left"/>
+      <w:pPr>
+        <w:ind w:left="5040" w:hanging="360"/>
+      </w:pPr>
+      <w:rPr>
+        <w:rFonts w:ascii="Symbol" w:hAnsi="Symbol" w:hint="default"/>
+      </w:rPr>
+    </w:lvl>
+    <w:lvl w:ilvl="7" w:tplc="04090003" w:tentative="1">
+      <w:start w:val="1"/>
+      <w:numFmt w:val="bullet"/>
+      <w:lvlText w:val="o"/>
+      <w:lvlJc w:val="left"/>
+      <w:pPr>
+        <w:ind w:left="5760" w:hanging="360"/>
+      </w:pPr>
+      <w:rPr>
+        <w:rFonts w:ascii="Courier New" w:hAnsi="Courier New" w:cs="Courier New" w:hint="default"/>
+      </w:rPr>
+    </w:lvl>
+    <w:lvl w:ilvl="8" w:tplc="04090005" w:tentative="1">
+      <w:start w:val="1"/>
+      <w:numFmt w:val="bullet"/>
+      <w:lvlText w:val=""/>
+      <w:lvlJc w:val="left"/>
+      <w:pPr>
+        <w:ind w:left="6480" w:hanging="360"/>
+      </w:pPr>
+      <w:rPr>
+        <w:rFonts w:ascii="Wingdings" w:hAnsi="Wingdings" w:hint="default"/>
+      </w:rPr>
+    </w:lvl>
+  </w:abstractNum>
+  <w:abstractNum w:abstractNumId="25" w15:restartNumberingAfterBreak="0">
+    <w:nsid w:val="7C117CA3"/>
+    <w:multiLevelType w:val="hybridMultilevel"/>
+    <w:tmpl w:val="4C1AE172"/>
+    <w:lvl w:ilvl="0" w:tplc="04090001">
+      <w:start w:val="1"/>
+      <w:numFmt w:val="bullet"/>
+      <w:lvlText w:val=""/>
+      <w:lvlJc w:val="left"/>
+      <w:pPr>
+        <w:ind w:left="1080" w:hanging="360"/>
+      </w:pPr>
+      <w:rPr>
+        <w:rFonts w:ascii="Symbol" w:hAnsi="Symbol" w:hint="default"/>
+      </w:rPr>
+    </w:lvl>
+    <w:lvl w:ilvl="1" w:tplc="FFFFFFFF">
+      <w:start w:val="1"/>
+      <w:numFmt w:val="bullet"/>
+      <w:lvlText w:val=""/>
+      <w:lvlJc w:val="left"/>
+      <w:pPr>
+        <w:ind w:left="1080" w:hanging="360"/>
+      </w:pPr>
+      <w:rPr>
+        <w:rFonts w:ascii="Symbol" w:hAnsi="Symbol" w:hint="default"/>
+      </w:rPr>
+    </w:lvl>
+    <w:lvl w:ilvl="2" w:tplc="FFFFFFFF">
+      <w:start w:val="1"/>
+      <w:numFmt w:val="lowerRoman"/>
+      <w:lvlText w:val="%3."/>
+      <w:lvlJc w:val="right"/>
+      <w:pPr>
+        <w:ind w:left="2520" w:hanging="180"/>
+      </w:pPr>
+    </w:lvl>
+    <w:lvl w:ilvl="3" w:tplc="FFFFFFFF" w:tentative="1">
+      <w:start w:val="1"/>
+      <w:numFmt w:val="decimal"/>
+      <w:lvlText w:val="%4."/>
+      <w:lvlJc w:val="left"/>
+      <w:pPr>
+        <w:ind w:left="3240" w:hanging="360"/>
+      </w:pPr>
+    </w:lvl>
+    <w:lvl w:ilvl="4" w:tplc="FFFFFFFF" w:tentative="1">
+      <w:start w:val="1"/>
+      <w:numFmt w:val="lowerLetter"/>
+      <w:lvlText w:val="%5."/>
+      <w:lvlJc w:val="left"/>
+      <w:pPr>
+        <w:ind w:left="3960" w:hanging="360"/>
+      </w:pPr>
+    </w:lvl>
+    <w:lvl w:ilvl="5" w:tplc="FFFFFFFF" w:tentative="1">
+      <w:start w:val="1"/>
+      <w:numFmt w:val="lowerRoman"/>
+      <w:lvlText w:val="%6."/>
+      <w:lvlJc w:val="right"/>
+      <w:pPr>
+        <w:ind w:left="4680" w:hanging="180"/>
+      </w:pPr>
+    </w:lvl>
+    <w:lvl w:ilvl="6" w:tplc="FFFFFFFF" w:tentative="1">
+      <w:start w:val="1"/>
+      <w:numFmt w:val="decimal"/>
+      <w:lvlText w:val="%7."/>
+      <w:lvlJc w:val="left"/>
+      <w:pPr>
+        <w:ind w:left="5400" w:hanging="360"/>
+      </w:pPr>
+    </w:lvl>
+    <w:lvl w:ilvl="7" w:tplc="FFFFFFFF" w:tentative="1">
+      <w:start w:val="1"/>
+      <w:numFmt w:val="lowerLetter"/>
+      <w:lvlText w:val="%8."/>
+      <w:lvlJc w:val="left"/>
+      <w:pPr>
+        <w:ind w:left="6120" w:hanging="360"/>
+      </w:pPr>
+    </w:lvl>
+    <w:lvl w:ilvl="8" w:tplc="FFFFFFFF" w:tentative="1">
+      <w:start w:val="1"/>
+      <w:numFmt w:val="lowerRoman"/>
+      <w:lvlText w:val="%9."/>
+      <w:lvlJc w:val="right"/>
+      <w:pPr>
+        <w:ind w:left="6840" w:hanging="180"/>
+      </w:pPr>
+    </w:lvl>
+  </w:abstractNum>
   <w:num w:numId="1" w16cid:durableId="1181746532">
-    <w:abstractNumId w:val="6"/>
+    <w:abstractNumId w:val="20"/>
   </w:num>
   <w:num w:numId="2" w16cid:durableId="1042248098">
-    <w:abstractNumId w:val="4"/>
+    <w:abstractNumId w:val="10"/>
   </w:num>
   <w:num w:numId="3" w16cid:durableId="1300064772">
-    <w:abstractNumId w:val="8"/>
+    <w:abstractNumId w:val="23"/>
   </w:num>
   <w:num w:numId="4" w16cid:durableId="711424487">
-    <w:abstractNumId w:val="7"/>
+    <w:abstractNumId w:val="22"/>
   </w:num>
   <w:num w:numId="5" w16cid:durableId="420419995">
-    <w:abstractNumId w:val="2"/>
+    <w:abstractNumId w:val="3"/>
   </w:num>
   <w:num w:numId="6" w16cid:durableId="646322537">
-    <w:abstractNumId w:val="1"/>
+    <w:abstractNumId w:val="2"/>
   </w:num>
   <w:num w:numId="7" w16cid:durableId="442697821">
     <w:abstractNumId w:val="0"/>
   </w:num>
   <w:num w:numId="8" w16cid:durableId="677270717">
-    <w:abstractNumId w:val="3"/>
+    <w:abstractNumId w:val="5"/>
   </w:num>
   <w:num w:numId="9" w16cid:durableId="1343437166">
-    <w:abstractNumId w:val="5"/>
+    <w:abstractNumId w:val="19"/>
+  </w:num>
+  <w:num w:numId="10" w16cid:durableId="1048265634">
+    <w:abstractNumId w:val="13"/>
+  </w:num>
+  <w:num w:numId="11" w16cid:durableId="461702720">
+    <w:abstractNumId w:val="1"/>
+  </w:num>
+  <w:num w:numId="12" w16cid:durableId="1733693539">
+    <w:abstractNumId w:val="17"/>
+  </w:num>
+  <w:num w:numId="13" w16cid:durableId="2022731951">
+    <w:abstractNumId w:val="9"/>
+  </w:num>
+  <w:num w:numId="14" w16cid:durableId="1051005573">
+    <w:abstractNumId w:val="7"/>
+  </w:num>
+  <w:num w:numId="15" w16cid:durableId="1190023903">
+    <w:abstractNumId w:val="24"/>
+  </w:num>
+  <w:num w:numId="16" w16cid:durableId="1873299562">
+    <w:abstractNumId w:val="16"/>
+  </w:num>
+  <w:num w:numId="17" w16cid:durableId="485512599">
+    <w:abstractNumId w:val="15"/>
+  </w:num>
+  <w:num w:numId="18" w16cid:durableId="646057116">
+    <w:abstractNumId w:val="8"/>
+  </w:num>
+  <w:num w:numId="19" w16cid:durableId="1353720708">
+    <w:abstractNumId w:val="25"/>
+  </w:num>
+  <w:num w:numId="20" w16cid:durableId="1385061462">
+    <w:abstractNumId w:val="6"/>
+  </w:num>
+  <w:num w:numId="21" w16cid:durableId="528762042">
+    <w:abstractNumId w:val="11"/>
+  </w:num>
+  <w:num w:numId="22" w16cid:durableId="1594195771">
+    <w:abstractNumId w:val="12"/>
+  </w:num>
+  <w:num w:numId="23" w16cid:durableId="1954290654">
+    <w:abstractNumId w:val="14"/>
+  </w:num>
+  <w:num w:numId="24" w16cid:durableId="1947422517">
+    <w:abstractNumId w:val="21"/>
+  </w:num>
+  <w:num w:numId="25" w16cid:durableId="13650664">
+    <w:abstractNumId w:val="18"/>
+  </w:num>
+  <w:num w:numId="26" w16cid:durableId="371659896">
+    <w:abstractNumId w:val="4"/>
   </w:num>
 </w:numbering>
 </file>
@@ -2397,10 +6276,9 @@
     <w:pPr>
       <w:keepNext/>
       <w:numPr>
-        <w:numId w:val="1"/>
+        <w:numId w:val="26"/>
       </w:numPr>
       <w:spacing w:before="480" w:after="120" w:line="240" w:lineRule="auto"/>
-      <w:ind w:left="431" w:hanging="431"/>
       <w:jc w:val="both"/>
       <w:outlineLvl w:val="0"/>
     </w:pPr>

</xml_diff>